<commit_message>
Eliminar las secciones sobrantes de la guía técnica
</commit_message>
<xml_diff>
--- a/docs/technical-walkthrough.docx
+++ b/docs/technical-walkthrough.docx
@@ -4703,479 +4703,7 @@
         <w:pStyle w:val="Heading1"/>
       </w:pPr>
       <w:r>
-        <w:t>15. C# syntax used in the project</w:t>
-      </w:r>
-    </w:p>
-    <w:tbl>
-      <w:tblPr>
-        <w:tblStyle w:val="LightShading-Accent1"/>
-        <w:tblW w:type="auto" w:w="0"/>
-        <w:tblLook w:firstColumn="1" w:firstRow="1" w:lastColumn="0" w:lastRow="0" w:noHBand="0" w:noVBand="1" w:val="04A0"/>
-      </w:tblPr>
-      <w:tblGrid>
-        <w:gridCol w:w="4933"/>
-        <w:gridCol w:w="4933"/>
-      </w:tblGrid>
-      <w:tr>
-        <w:tc>
-          <w:tcPr>
-            <w:tcW w:type="dxa" w:w="4933"/>
-          </w:tcPr>
-          <w:p>
-            <w:r>
-              <w:rPr>
-                <w:b/>
-              </w:rPr>
-              <w:t>Syntax</w:t>
-            </w:r>
-          </w:p>
-        </w:tc>
-        <w:tc>
-          <w:tcPr>
-            <w:tcW w:type="dxa" w:w="4933"/>
-          </w:tcPr>
-          <w:p>
-            <w:r>
-              <w:rPr>
-                <w:b/>
-              </w:rPr>
-              <w:t>Meaning in this project</w:t>
-            </w:r>
-          </w:p>
-        </w:tc>
-      </w:tr>
-      <w:tr>
-        <w:tc>
-          <w:tcPr>
-            <w:tcW w:type="dxa" w:w="4933"/>
-          </w:tcPr>
-          <w:p>
-            <w:r/>
-            <w:r>
-              <w:rPr>
-                <w:rFonts w:ascii="Consolas" w:hAnsi="Consolas"/>
-                <w:sz w:val="18"/>
-              </w:rPr>
-              <w:t>async</w:t>
-            </w:r>
-            <w:r>
-              <w:t xml:space="preserve"> / </w:t>
-            </w:r>
-            <w:r>
-              <w:rPr>
-                <w:rFonts w:ascii="Consolas" w:hAnsi="Consolas"/>
-                <w:sz w:val="18"/>
-              </w:rPr>
-              <w:t>await</w:t>
-            </w:r>
-            <w:r/>
-          </w:p>
-        </w:tc>
-        <w:tc>
-          <w:tcPr>
-            <w:tcW w:type="dxa" w:w="4933"/>
-          </w:tcPr>
-          <w:p>
-            <w:r>
-              <w:t>Allow HTTP and file waits without blocking the calling thread while awaiting I/O</w:t>
-            </w:r>
-          </w:p>
-        </w:tc>
-      </w:tr>
-      <w:tr>
-        <w:tc>
-          <w:tcPr>
-            <w:tcW w:type="dxa" w:w="4933"/>
-          </w:tcPr>
-          <w:p>
-            <w:r/>
-            <w:r>
-              <w:rPr>
-                <w:rFonts w:ascii="Consolas" w:hAnsi="Consolas"/>
-                <w:sz w:val="18"/>
-              </w:rPr>
-              <w:t>Task&lt;T&gt;</w:t>
-            </w:r>
-            <w:r/>
-          </w:p>
-        </w:tc>
-        <w:tc>
-          <w:tcPr>
-            <w:tcW w:type="dxa" w:w="4933"/>
-          </w:tcPr>
-          <w:p>
-            <w:r>
-              <w:t>A future result, such as UpdateResult or a listing</w:t>
-            </w:r>
-          </w:p>
-        </w:tc>
-      </w:tr>
-      <w:tr>
-        <w:tc>
-          <w:tcPr>
-            <w:tcW w:type="dxa" w:w="4933"/>
-          </w:tcPr>
-          <w:p>
-            <w:r/>
-            <w:r>
-              <w:rPr>
-                <w:rFonts w:ascii="Consolas" w:hAnsi="Consolas"/>
-                <w:sz w:val="18"/>
-              </w:rPr>
-              <w:t>CancellationToken</w:t>
-            </w:r>
-            <w:r/>
-          </w:p>
-        </w:tc>
-        <w:tc>
-          <w:tcPr>
-            <w:tcW w:type="dxa" w:w="4933"/>
-          </w:tcPr>
-          <w:p>
-            <w:r>
-              <w:t>A cancellation request shared across operations</w:t>
-            </w:r>
-          </w:p>
-        </w:tc>
-      </w:tr>
-      <w:tr>
-        <w:tc>
-          <w:tcPr>
-            <w:tcW w:type="dxa" w:w="4933"/>
-          </w:tcPr>
-          <w:p>
-            <w:r/>
-            <w:r>
-              <w:rPr>
-                <w:rFonts w:ascii="Consolas" w:hAnsi="Consolas"/>
-                <w:sz w:val="18"/>
-              </w:rPr>
-              <w:t>using</w:t>
-            </w:r>
-            <w:r>
-              <w:t xml:space="preserve"> / </w:t>
-            </w:r>
-            <w:r>
-              <w:rPr>
-                <w:rFonts w:ascii="Consolas" w:hAnsi="Consolas"/>
-                <w:sz w:val="18"/>
-              </w:rPr>
-              <w:t>await using</w:t>
-            </w:r>
-            <w:r/>
-          </w:p>
-        </w:tc>
-        <w:tc>
-          <w:tcPr>
-            <w:tcW w:type="dxa" w:w="4933"/>
-          </w:tcPr>
-          <w:p>
-            <w:r>
-              <w:t>Dispose clients, responses, archives, and streams when leaving the scope</w:t>
-            </w:r>
-          </w:p>
-        </w:tc>
-      </w:tr>
-      <w:tr>
-        <w:tc>
-          <w:tcPr>
-            <w:tcW w:type="dxa" w:w="4933"/>
-          </w:tcPr>
-          <w:p>
-            <w:r/>
-            <w:r>
-              <w:rPr>
-                <w:rFonts w:ascii="Consolas" w:hAnsi="Consolas"/>
-                <w:sz w:val="18"/>
-              </w:rPr>
-              <w:t>record</w:t>
-            </w:r>
-            <w:r/>
-          </w:p>
-        </w:tc>
-        <w:tc>
-          <w:tcPr>
-            <w:tcW w:type="dxa" w:w="4933"/>
-          </w:tcPr>
-          <w:p>
-            <w:r>
-              <w:t>A data type with generated value equality and properties</w:t>
-            </w:r>
-          </w:p>
-        </w:tc>
-      </w:tr>
-      <w:tr>
-        <w:tc>
-          <w:tcPr>
-            <w:tcW w:type="dxa" w:w="4933"/>
-          </w:tcPr>
-          <w:p>
-            <w:r/>
-            <w:r>
-              <w:rPr>
-                <w:rFonts w:ascii="Consolas" w:hAnsi="Consolas"/>
-                <w:sz w:val="18"/>
-              </w:rPr>
-              <w:t>record struct</w:t>
-            </w:r>
-            <w:r/>
-          </w:p>
-        </w:tc>
-        <w:tc>
-          <w:tcPr>
-            <w:tcW w:type="dxa" w:w="4933"/>
-          </w:tcPr>
-          <w:p>
-            <w:r>
-              <w:t>A value type used for the three version numbers</w:t>
-            </w:r>
-          </w:p>
-        </w:tc>
-      </w:tr>
-      <w:tr>
-        <w:tc>
-          <w:tcPr>
-            <w:tcW w:type="dxa" w:w="4933"/>
-          </w:tcPr>
-          <w:p>
-            <w:r/>
-            <w:r>
-              <w:rPr>
-                <w:rFonts w:ascii="Consolas" w:hAnsi="Consolas"/>
-                <w:sz w:val="18"/>
-              </w:rPr>
-              <w:t>sealed</w:t>
-            </w:r>
-            <w:r/>
-          </w:p>
-        </w:tc>
-        <w:tc>
-          <w:tcPr>
-            <w:tcW w:type="dxa" w:w="4933"/>
-          </w:tcPr>
-          <w:p>
-            <w:r>
-              <w:t>Prevent inheritance from a class or record</w:t>
-            </w:r>
-          </w:p>
-        </w:tc>
-      </w:tr>
-      <w:tr>
-        <w:tc>
-          <w:tcPr>
-            <w:tcW w:type="dxa" w:w="4933"/>
-          </w:tcPr>
-          <w:p>
-            <w:r/>
-            <w:r>
-              <w:rPr>
-                <w:rFonts w:ascii="Consolas" w:hAnsi="Consolas"/>
-                <w:sz w:val="18"/>
-              </w:rPr>
-              <w:t>partial</w:t>
-            </w:r>
-            <w:r/>
-          </w:p>
-        </w:tc>
-        <w:tc>
-          <w:tcPr>
-            <w:tcW w:type="dxa" w:w="4933"/>
-          </w:tcPr>
-          <w:p>
-            <w:r>
-              <w:t>Split one class across multiple source files</w:t>
-            </w:r>
-          </w:p>
-        </w:tc>
-      </w:tr>
-      <w:tr>
-        <w:tc>
-          <w:tcPr>
-            <w:tcW w:type="dxa" w:w="4933"/>
-          </w:tcPr>
-          <w:p>
-            <w:r/>
-            <w:r>
-              <w:rPr>
-                <w:rFonts w:ascii="Consolas" w:hAnsi="Consolas"/>
-                <w:sz w:val="18"/>
-              </w:rPr>
-              <w:t>string?</w:t>
-            </w:r>
-            <w:r>
-              <w:t xml:space="preserve"> / </w:t>
-            </w:r>
-            <w:r>
-              <w:rPr>
-                <w:rFonts w:ascii="Consolas" w:hAnsi="Consolas"/>
-                <w:sz w:val="18"/>
-              </w:rPr>
-              <w:t>long?</w:t>
-            </w:r>
-            <w:r/>
-          </w:p>
-        </w:tc>
-        <w:tc>
-          <w:tcPr>
-            <w:tcW w:type="dxa" w:w="4933"/>
-          </w:tcPr>
-          <w:p>
-            <w:r>
-              <w:t>Allow a null reference or nullable number</w:t>
-            </w:r>
-          </w:p>
-        </w:tc>
-      </w:tr>
-      <w:tr>
-        <w:tc>
-          <w:tcPr>
-            <w:tcW w:type="dxa" w:w="4933"/>
-          </w:tcPr>
-          <w:p>
-            <w:r/>
-            <w:r>
-              <w:rPr>
-                <w:rFonts w:ascii="Consolas" w:hAnsi="Consolas"/>
-                <w:sz w:val="18"/>
-              </w:rPr>
-              <w:t>?.</w:t>
-            </w:r>
-            <w:r/>
-          </w:p>
-        </w:tc>
-        <w:tc>
-          <w:tcPr>
-            <w:tcW w:type="dxa" w:w="4933"/>
-          </w:tcPr>
-          <w:p>
-            <w:r>
-              <w:t>Access a member only when its owner is not null</w:t>
-            </w:r>
-          </w:p>
-        </w:tc>
-      </w:tr>
-      <w:tr>
-        <w:tc>
-          <w:tcPr>
-            <w:tcW w:type="dxa" w:w="4933"/>
-          </w:tcPr>
-          <w:p>
-            <w:r/>
-            <w:r>
-              <w:rPr>
-                <w:rFonts w:ascii="Consolas" w:hAnsi="Consolas"/>
-                <w:sz w:val="18"/>
-              </w:rPr>
-              <w:t>??</w:t>
-            </w:r>
-            <w:r/>
-          </w:p>
-        </w:tc>
-        <w:tc>
-          <w:tcPr>
-            <w:tcW w:type="dxa" w:w="4933"/>
-          </w:tcPr>
-          <w:p>
-            <w:r>
-              <w:t>Use a fallback value when the left side is null</w:t>
-            </w:r>
-          </w:p>
-        </w:tc>
-      </w:tr>
-      <w:tr>
-        <w:tc>
-          <w:tcPr>
-            <w:tcW w:type="dxa" w:w="4933"/>
-          </w:tcPr>
-          <w:p>
-            <w:r/>
-            <w:r>
-              <w:rPr>
-                <w:rFonts w:ascii="Consolas" w:hAnsi="Consolas"/>
-                <w:sz w:val="18"/>
-              </w:rPr>
-              <w:t>..</w:t>
-            </w:r>
-            <w:r>
-              <w:t xml:space="preserve"> and </w:t>
-            </w:r>
-            <w:r>
-              <w:rPr>
-                <w:rFonts w:ascii="Consolas" w:hAnsi="Consolas"/>
-                <w:sz w:val="18"/>
-              </w:rPr>
-              <w:t>^4</w:t>
-            </w:r>
-            <w:r/>
-          </w:p>
-        </w:tc>
-        <w:tc>
-          <w:tcPr>
-            <w:tcW w:type="dxa" w:w="4933"/>
-          </w:tcPr>
-          <w:p>
-            <w:r>
-              <w:t>Slice a string; count a position from the end</w:t>
-            </w:r>
-          </w:p>
-        </w:tc>
-      </w:tr>
-      <w:tr>
-        <w:tc>
-          <w:tcPr>
-            <w:tcW w:type="dxa" w:w="4933"/>
-          </w:tcPr>
-          <w:p>
-            <w:r/>
-            <w:r>
-              <w:rPr>
-                <w:rFonts w:ascii="Consolas" w:hAnsi="Consolas"/>
-                <w:sz w:val="18"/>
-              </w:rPr>
-              <w:t>try</w:t>
-            </w:r>
-            <w:r>
-              <w:t xml:space="preserve"> / </w:t>
-            </w:r>
-            <w:r>
-              <w:rPr>
-                <w:rFonts w:ascii="Consolas" w:hAnsi="Consolas"/>
-                <w:sz w:val="18"/>
-              </w:rPr>
-              <w:t>catch</w:t>
-            </w:r>
-            <w:r>
-              <w:t xml:space="preserve"> / </w:t>
-            </w:r>
-            <w:r>
-              <w:rPr>
-                <w:rFonts w:ascii="Consolas" w:hAnsi="Consolas"/>
-                <w:sz w:val="18"/>
-              </w:rPr>
-              <w:t>finally</w:t>
-            </w:r>
-            <w:r/>
-          </w:p>
-        </w:tc>
-        <w:tc>
-          <w:tcPr>
-            <w:tcW w:type="dxa" w:w="4933"/>
-          </w:tcPr>
-          <w:p>
-            <w:r>
-              <w:t>Run an operation, handle failures, and perform cleanup</w:t>
-            </w:r>
-          </w:p>
-        </w:tc>
-      </w:tr>
-    </w:tbl>
-    <w:p/>
-    <w:p>
-      <w:pPr>
-        <w:pStyle w:val="Heading1"/>
-      </w:pPr>
-      <w:r>
-        <w:t>16. Commands to try</w:t>
+        <w:t>15. Commands to try</w:t>
       </w:r>
     </w:p>
     <w:p>
@@ -5229,7 +4757,7 @@
         <w:pStyle w:val="Heading1"/>
       </w:pPr>
       <w:r>
-        <w:t>17. Current limits and next steps</w:t>
+        <w:t>16. Current limits and next steps</w:t>
       </w:r>
     </w:p>
     <w:p>
@@ -5291,42 +4819,6 @@
     <w:p>
       <w:r>
         <w:t>Suggested reading order: Models.cs, UpdateService.cs, UpdateApiClient.cs, PackageSelector.cs, PackageVersion.cs, PackageDownload.cs, then the CLI and tests.</w:t>
-      </w:r>
-    </w:p>
-    <w:p>
-      <w:pPr>
-        <w:pStyle w:val="Heading1"/>
-      </w:pPr>
-      <w:r>
-        <w:t>18. Document maintenance</w:t>
-      </w:r>
-    </w:p>
-    <w:p>
-      <w:r>
-        <w:t>This Markdown file is the editable source for the Word document. Regenerate the Word version after changing the guide:</w:t>
-      </w:r>
-    </w:p>
-    <w:p>
-      <w:pPr>
-        <w:pStyle w:val="CodeBlock"/>
-        <w:shd w:fill="F2F4F7"/>
-      </w:pPr>
-      <w:r>
-        <w:t>python -m pip install -r scripts/requirements-docs.txt</w:t>
-      </w:r>
-    </w:p>
-    <w:p>
-      <w:pPr>
-        <w:pStyle w:val="CodeBlock"/>
-        <w:shd w:fill="F2F4F7"/>
-      </w:pPr>
-      <w:r>
-        <w:t>python scripts/export_technical_doc.py</w:t>
-      </w:r>
-    </w:p>
-    <w:p>
-      <w:r>
-        <w:t>These are documentation-export dependencies, not dependencies of the .NET application. The exporter writes docs/technical-walkthrough.docx from this Markdown document.</w:t>
       </w:r>
     </w:p>
     <w:sectPr>

</xml_diff>

<commit_message>
Añadir comentarios y mejorar la legibilidad del código
</commit_message>
<xml_diff>
--- a/docs/technical-walkthrough.docx
+++ b/docs/technical-walkthrough.docx
@@ -767,6 +767,15 @@
         <w:shd w:fill="F2F4F7"/>
       </w:pPr>
       <w:r>
+        <w:t>// One file or folder from the API listing. Attributes map the lowercase JSON fields.</w:t>
+      </w:r>
+    </w:p>
+    <w:p>
+      <w:pPr>
+        <w:pStyle w:val="CodeBlock"/>
+        <w:shd w:fill="F2F4F7"/>
+      </w:pPr>
+      <w:r>
         <w:t>public sealed record FileEntry(</w:t>
       </w:r>
     </w:p>
@@ -830,7 +839,70 @@
         <w:shd w:fill="F2F4F7"/>
       </w:pPr>
       <w:r>
-        <w:t>public sealed record UpdateRequest(string ClientFolder, string Product, string InstalledVersion, string DestinationDirectory);</w:t>
+        <w:t>// Tytan supplies these values; the updater does not inspect the installed application.</w:t>
+      </w:r>
+    </w:p>
+    <w:p>
+      <w:pPr>
+        <w:pStyle w:val="CodeBlock"/>
+        <w:shd w:fill="F2F4F7"/>
+      </w:pPr>
+      <w:r>
+        <w:t>public sealed record UpdateRequest(</w:t>
+      </w:r>
+    </w:p>
+    <w:p>
+      <w:pPr>
+        <w:pStyle w:val="CodeBlock"/>
+        <w:shd w:fill="F2F4F7"/>
+      </w:pPr>
+      <w:r>
+        <w:t xml:space="preserve">    string ClientFolder,</w:t>
+      </w:r>
+    </w:p>
+    <w:p>
+      <w:pPr>
+        <w:pStyle w:val="CodeBlock"/>
+        <w:shd w:fill="F2F4F7"/>
+      </w:pPr>
+      <w:r>
+        <w:t xml:space="preserve">    string Product,</w:t>
+      </w:r>
+    </w:p>
+    <w:p>
+      <w:pPr>
+        <w:pStyle w:val="CodeBlock"/>
+        <w:shd w:fill="F2F4F7"/>
+      </w:pPr>
+      <w:r>
+        <w:t xml:space="preserve">    string InstalledVersion,</w:t>
+      </w:r>
+    </w:p>
+    <w:p>
+      <w:pPr>
+        <w:pStyle w:val="CodeBlock"/>
+        <w:shd w:fill="F2F4F7"/>
+      </w:pPr>
+      <w:r>
+        <w:t xml:space="preserve">    string DestinationDirectory);</w:t>
+      </w:r>
+    </w:p>
+    <w:p>
+      <w:pPr>
+        <w:pStyle w:val="CodeBlock"/>
+        <w:shd w:fill="F2F4F7"/>
+      </w:pPr>
+      <w:r>
+        <w:t xml:space="preserve"> </w:t>
+      </w:r>
+    </w:p>
+    <w:p>
+      <w:pPr>
+        <w:pStyle w:val="CodeBlock"/>
+        <w:shd w:fill="F2F4F7"/>
+      </w:pPr>
+      <w:r>
+        <w:t>// A remote file paired with its parsed numeric version.</w:t>
       </w:r>
     </w:p>
     <w:p>
@@ -848,25 +920,160 @@
         <w:shd w:fill="F2F4F7"/>
       </w:pPr>
       <w:r>
-        <w:t>public enum UpdateStatus { NoUpdate, Downloaded, Error, Cancelled }</w:t>
-      </w:r>
-    </w:p>
-    <w:p>
-      <w:pPr>
-        <w:pStyle w:val="CodeBlock"/>
-        <w:shd w:fill="F2F4F7"/>
-      </w:pPr>
-      <w:r>
-        <w:t>public sealed record UpdateResult(UpdateStatus Status, string Product, string InstalledVersion,</w:t>
-      </w:r>
-    </w:p>
-    <w:p>
-      <w:pPr>
-        <w:pStyle w:val="CodeBlock"/>
-        <w:shd w:fill="F2F4F7"/>
-      </w:pPr>
-      <w:r>
-        <w:t xml:space="preserve">    string? AvailableVersion = null, string? LocalPath = null, string? Message = null);</w:t>
+        <w:t xml:space="preserve"> </w:t>
+      </w:r>
+    </w:p>
+    <w:p>
+      <w:pPr>
+        <w:pStyle w:val="CodeBlock"/>
+        <w:shd w:fill="F2F4F7"/>
+      </w:pPr>
+      <w:r>
+        <w:t>// Downloaded means the ZIP is ready for Tytan, not that it has been installed.</w:t>
+      </w:r>
+    </w:p>
+    <w:p>
+      <w:pPr>
+        <w:pStyle w:val="CodeBlock"/>
+        <w:shd w:fill="F2F4F7"/>
+      </w:pPr>
+      <w:r>
+        <w:t>public enum UpdateStatus</w:t>
+      </w:r>
+    </w:p>
+    <w:p>
+      <w:pPr>
+        <w:pStyle w:val="CodeBlock"/>
+        <w:shd w:fill="F2F4F7"/>
+      </w:pPr>
+      <w:r>
+        <w:t>{</w:t>
+      </w:r>
+    </w:p>
+    <w:p>
+      <w:pPr>
+        <w:pStyle w:val="CodeBlock"/>
+        <w:shd w:fill="F2F4F7"/>
+      </w:pPr>
+      <w:r>
+        <w:t xml:space="preserve">    NoUpdate,</w:t>
+      </w:r>
+    </w:p>
+    <w:p>
+      <w:pPr>
+        <w:pStyle w:val="CodeBlock"/>
+        <w:shd w:fill="F2F4F7"/>
+      </w:pPr>
+      <w:r>
+        <w:t xml:space="preserve">    Downloaded,</w:t>
+      </w:r>
+    </w:p>
+    <w:p>
+      <w:pPr>
+        <w:pStyle w:val="CodeBlock"/>
+        <w:shd w:fill="F2F4F7"/>
+      </w:pPr>
+      <w:r>
+        <w:t xml:space="preserve">    Error,</w:t>
+      </w:r>
+    </w:p>
+    <w:p>
+      <w:pPr>
+        <w:pStyle w:val="CodeBlock"/>
+        <w:shd w:fill="F2F4F7"/>
+      </w:pPr>
+      <w:r>
+        <w:t xml:space="preserve">    Cancelled</w:t>
+      </w:r>
+    </w:p>
+    <w:p>
+      <w:pPr>
+        <w:pStyle w:val="CodeBlock"/>
+        <w:shd w:fill="F2F4F7"/>
+      </w:pPr>
+      <w:r>
+        <w:t>}</w:t>
+      </w:r>
+    </w:p>
+    <w:p>
+      <w:pPr>
+        <w:pStyle w:val="CodeBlock"/>
+        <w:shd w:fill="F2F4F7"/>
+      </w:pPr>
+      <w:r>
+        <w:t xml:space="preserve"> </w:t>
+      </w:r>
+    </w:p>
+    <w:p>
+      <w:pPr>
+        <w:pStyle w:val="CodeBlock"/>
+        <w:shd w:fill="F2F4F7"/>
+      </w:pPr>
+      <w:r>
+        <w:t>// LocalPath is populated only after a complete package has been published locally.</w:t>
+      </w:r>
+    </w:p>
+    <w:p>
+      <w:pPr>
+        <w:pStyle w:val="CodeBlock"/>
+        <w:shd w:fill="F2F4F7"/>
+      </w:pPr>
+      <w:r>
+        <w:t>public sealed record UpdateResult(</w:t>
+      </w:r>
+    </w:p>
+    <w:p>
+      <w:pPr>
+        <w:pStyle w:val="CodeBlock"/>
+        <w:shd w:fill="F2F4F7"/>
+      </w:pPr>
+      <w:r>
+        <w:t xml:space="preserve">    UpdateStatus Status,</w:t>
+      </w:r>
+    </w:p>
+    <w:p>
+      <w:pPr>
+        <w:pStyle w:val="CodeBlock"/>
+        <w:shd w:fill="F2F4F7"/>
+      </w:pPr>
+      <w:r>
+        <w:t xml:space="preserve">    string Product,</w:t>
+      </w:r>
+    </w:p>
+    <w:p>
+      <w:pPr>
+        <w:pStyle w:val="CodeBlock"/>
+        <w:shd w:fill="F2F4F7"/>
+      </w:pPr>
+      <w:r>
+        <w:t xml:space="preserve">    string InstalledVersion,</w:t>
+      </w:r>
+    </w:p>
+    <w:p>
+      <w:pPr>
+        <w:pStyle w:val="CodeBlock"/>
+        <w:shd w:fill="F2F4F7"/>
+      </w:pPr>
+      <w:r>
+        <w:t xml:space="preserve">    string? AvailableVersion = null,</w:t>
+      </w:r>
+    </w:p>
+    <w:p>
+      <w:pPr>
+        <w:pStyle w:val="CodeBlock"/>
+        <w:shd w:fill="F2F4F7"/>
+      </w:pPr>
+      <w:r>
+        <w:t xml:space="preserve">    string? LocalPath = null,</w:t>
+      </w:r>
+    </w:p>
+    <w:p>
+      <w:pPr>
+        <w:pStyle w:val="CodeBlock"/>
+        <w:shd w:fill="F2F4F7"/>
+      </w:pPr>
+      <w:r>
+        <w:t xml:space="preserve">    string? Message = null);</w:t>
       </w:r>
     </w:p>
     <w:p>
@@ -1253,6 +1460,24 @@
         <w:shd w:fill="F2F4F7"/>
       </w:pPr>
       <w:r>
+        <w:t xml:space="preserve"> </w:t>
+      </w:r>
+    </w:p>
+    <w:p>
+      <w:pPr>
+        <w:pStyle w:val="CodeBlock"/>
+        <w:shd w:fill="F2F4F7"/>
+      </w:pPr>
+      <w:r>
+        <w:t xml:space="preserve">            // Missing, equal, or older versions do not trigger a download.</w:t>
+      </w:r>
+    </w:p>
+    <w:p>
+      <w:pPr>
+        <w:pStyle w:val="CodeBlock"/>
+        <w:shd w:fill="F2F4F7"/>
+      </w:pPr>
+      <w:r>
         <w:t xml:space="preserve">            if (package is null || package.Version.CompareTo(installed) &lt;= 0)</w:t>
       </w:r>
     </w:p>
@@ -1262,6 +1487,15 @@
         <w:shd w:fill="F2F4F7"/>
       </w:pPr>
       <w:r>
+        <w:t xml:space="preserve">            {</w:t>
+      </w:r>
+    </w:p>
+    <w:p>
+      <w:pPr>
+        <w:pStyle w:val="CodeBlock"/>
+        <w:shd w:fill="F2F4F7"/>
+      </w:pPr>
+      <w:r>
         <w:t xml:space="preserve">                return new(UpdateStatus.NoUpdate, request.Product, request.InstalledVersion, available,</w:t>
       </w:r>
     </w:p>
@@ -1272,6 +1506,33 @@
       </w:pPr>
       <w:r>
         <w:t xml:space="preserve">                    Message: package is null ? "No package is available for this product." : "No newer version is available.");</w:t>
+      </w:r>
+    </w:p>
+    <w:p>
+      <w:pPr>
+        <w:pStyle w:val="CodeBlock"/>
+        <w:shd w:fill="F2F4F7"/>
+      </w:pPr>
+      <w:r>
+        <w:t xml:space="preserve">            }</w:t>
+      </w:r>
+    </w:p>
+    <w:p>
+      <w:pPr>
+        <w:pStyle w:val="CodeBlock"/>
+        <w:shd w:fill="F2F4F7"/>
+      </w:pPr>
+      <w:r>
+        <w:t xml:space="preserve"> </w:t>
+      </w:r>
+    </w:p>
+    <w:p>
+      <w:pPr>
+        <w:pStyle w:val="CodeBlock"/>
+        <w:shd w:fill="F2F4F7"/>
+      </w:pPr>
+      <w:r>
+        <w:t xml:space="preserve">            // Deliver the ZIP path while preserving the original installed version.</w:t>
       </w:r>
     </w:p>
     <w:p>
@@ -1442,6 +1703,24 @@
         <w:shd w:fill="F2F4F7"/>
       </w:pPr>
       <w:r>
+        <w:t xml:space="preserve"> </w:t>
+      </w:r>
+    </w:p>
+    <w:p>
+      <w:pPr>
+        <w:pStyle w:val="CodeBlock"/>
+        <w:shd w:fill="F2F4F7"/>
+      </w:pPr>
+      <w:r>
+        <w:t xml:space="preserve">        // Avoid leaking raw request details through connection error messages.</w:t>
+      </w:r>
+    </w:p>
+    <w:p>
+      <w:pPr>
+        <w:pStyle w:val="CodeBlock"/>
+        <w:shd w:fill="F2F4F7"/>
+      </w:pPr>
+      <w:r>
         <w:t xml:space="preserve">        catch (HttpRequestException e)</w:t>
       </w:r>
     </w:p>
@@ -1650,6 +1929,15 @@
         <w:shd w:fill="F2F4F7"/>
       </w:pPr>
       <w:r>
+        <w:t xml:space="preserve">        {</w:t>
+      </w:r>
+    </w:p>
+    <w:p>
+      <w:pPr>
+        <w:pStyle w:val="CodeBlock"/>
+        <w:shd w:fill="F2F4F7"/>
+      </w:pPr>
+      <w:r>
         <w:t xml:space="preserve">            throw new ArgumentOutOfRangeException(nameof(timeout));</w:t>
       </w:r>
     </w:p>
@@ -1659,6 +1947,24 @@
         <w:shd w:fill="F2F4F7"/>
       </w:pPr>
       <w:r>
+        <w:t xml:space="preserve">        }</w:t>
+      </w:r>
+    </w:p>
+    <w:p>
+      <w:pPr>
+        <w:pStyle w:val="CodeBlock"/>
+        <w:shd w:fill="F2F4F7"/>
+      </w:pPr>
+      <w:r>
+        <w:t xml:space="preserve"> </w:t>
+      </w:r>
+    </w:p>
+    <w:p>
+      <w:pPr>
+        <w:pStyle w:val="CodeBlock"/>
+        <w:shd w:fill="F2F4F7"/>
+      </w:pPr>
+      <w:r>
         <w:t xml:space="preserve">        this.baseUri = new Uri(baseUri.AbsoluteUri.TrimEnd('/') + "/");</w:t>
       </w:r>
     </w:p>
@@ -1668,7 +1974,43 @@
         <w:shd w:fill="F2F4F7"/>
       </w:pPr>
       <w:r>
+        <w:t xml:space="preserve"> </w:t>
+      </w:r>
+    </w:p>
+    <w:p>
+      <w:pPr>
+        <w:pStyle w:val="CodeBlock"/>
+        <w:shd w:fill="F2F4F7"/>
+      </w:pPr>
+      <w:r>
+        <w:t xml:space="preserve">        // Base64 encodes credentials; HTTPS provides transport encryption.</w:t>
+      </w:r>
+    </w:p>
+    <w:p>
+      <w:pPr>
+        <w:pStyle w:val="CodeBlock"/>
+        <w:shd w:fill="F2F4F7"/>
+      </w:pPr>
+      <w:r>
         <w:t xml:space="preserve">        authentication = new("Basic", Convert.ToBase64String(Encoding.UTF8.GetBytes(username + ":" + password)));</w:t>
+      </w:r>
+    </w:p>
+    <w:p>
+      <w:pPr>
+        <w:pStyle w:val="CodeBlock"/>
+        <w:shd w:fill="F2F4F7"/>
+      </w:pPr>
+      <w:r>
+        <w:t xml:space="preserve"> </w:t>
+      </w:r>
+    </w:p>
+    <w:p>
+      <w:pPr>
+        <w:pStyle w:val="CodeBlock"/>
+        <w:shd w:fill="F2F4F7"/>
+      </w:pPr>
+      <w:r>
+        <w:t xml:space="preserve">        // Disable redirects so access stays on the configured endpoint.</w:t>
       </w:r>
     </w:p>
     <w:p>
@@ -1727,7 +2069,52 @@
         <w:shd w:fill="F2F4F7"/>
       </w:pPr>
       <w:r>
-        <w:t xml:space="preserve">        if (clientFolder is not null) PathRules.ValidateSegment(clientFolder, "Client folder");</w:t>
+        <w:t xml:space="preserve">        if (clientFolder is not null)</w:t>
+      </w:r>
+    </w:p>
+    <w:p>
+      <w:pPr>
+        <w:pStyle w:val="CodeBlock"/>
+        <w:shd w:fill="F2F4F7"/>
+      </w:pPr>
+      <w:r>
+        <w:t xml:space="preserve">        {</w:t>
+      </w:r>
+    </w:p>
+    <w:p>
+      <w:pPr>
+        <w:pStyle w:val="CodeBlock"/>
+        <w:shd w:fill="F2F4F7"/>
+      </w:pPr>
+      <w:r>
+        <w:t xml:space="preserve">            PathRules.ValidateSegment(clientFolder, "Client folder");</w:t>
+      </w:r>
+    </w:p>
+    <w:p>
+      <w:pPr>
+        <w:pStyle w:val="CodeBlock"/>
+        <w:shd w:fill="F2F4F7"/>
+      </w:pPr>
+      <w:r>
+        <w:t xml:space="preserve">        }</w:t>
+      </w:r>
+    </w:p>
+    <w:p>
+      <w:pPr>
+        <w:pStyle w:val="CodeBlock"/>
+        <w:shd w:fill="F2F4F7"/>
+      </w:pPr>
+      <w:r>
+        <w:t xml:space="preserve"> </w:t>
+      </w:r>
+    </w:p>
+    <w:p>
+      <w:pPr>
+        <w:pStyle w:val="CodeBlock"/>
+        <w:shd w:fill="F2F4F7"/>
+      </w:pPr>
+      <w:r>
+        <w:t xml:space="preserve">        // Encode query values so spaces and punctuation do not alter the URL.</w:t>
       </w:r>
     </w:p>
     <w:p>
@@ -1772,6 +2159,24 @@
         <w:shd w:fill="F2F4F7"/>
       </w:pPr>
       <w:r>
+        <w:t xml:space="preserve"> </w:t>
+      </w:r>
+    </w:p>
+    <w:p>
+      <w:pPr>
+        <w:pStyle w:val="CodeBlock"/>
+        <w:shd w:fill="F2F4F7"/>
+      </w:pPr>
+      <w:r>
+        <w:t xml:space="preserve">        // Read JSON from the response stream instead of buffering it as a string.</w:t>
+      </w:r>
+    </w:p>
+    <w:p>
+      <w:pPr>
+        <w:pStyle w:val="CodeBlock"/>
+        <w:shd w:fill="F2F4F7"/>
+      </w:pPr>
+      <w:r>
         <w:t xml:space="preserve">        await using var stream = await response.Content.ReadAsStreamAsync(cancellationToken);</w:t>
       </w:r>
     </w:p>
@@ -1781,6 +2186,24 @@
         <w:shd w:fill="F2F4F7"/>
       </w:pPr>
       <w:r>
+        <w:t xml:space="preserve"> </w:t>
+      </w:r>
+    </w:p>
+    <w:p>
+      <w:pPr>
+        <w:pStyle w:val="CodeBlock"/>
+        <w:shd w:fill="F2F4F7"/>
+      </w:pPr>
+      <w:r>
+        <w:t xml:space="preserve">        // The body read has its own timeout after the response headers arrive.</w:t>
+      </w:r>
+    </w:p>
+    <w:p>
+      <w:pPr>
+        <w:pStyle w:val="CodeBlock"/>
+        <w:shd w:fill="F2F4F7"/>
+      </w:pPr>
+      <w:r>
         <w:t xml:space="preserve">        using var timeout = CancellationTokenSource.CreateLinkedTokenSource(cancellationToken);</w:t>
       </w:r>
     </w:p>
@@ -1799,6 +2222,15 @@
         <w:shd w:fill="F2F4F7"/>
       </w:pPr>
       <w:r>
+        <w:t xml:space="preserve"> </w:t>
+      </w:r>
+    </w:p>
+    <w:p>
+      <w:pPr>
+        <w:pStyle w:val="CodeBlock"/>
+        <w:shd w:fill="F2F4F7"/>
+      </w:pPr>
+      <w:r>
         <w:t xml:space="preserve">        try</w:t>
       </w:r>
     </w:p>
@@ -1826,6 +2258,24 @@
         <w:shd w:fill="F2F4F7"/>
       </w:pPr>
       <w:r>
+        <w:t xml:space="preserve"> </w:t>
+      </w:r>
+    </w:p>
+    <w:p>
+      <w:pPr>
+        <w:pStyle w:val="CodeBlock"/>
+        <w:shd w:fill="F2F4F7"/>
+      </w:pPr>
+      <w:r>
+        <w:t xml:space="preserve">            // Fail clearly on incomplete listings rather than reporting no update.</w:t>
+      </w:r>
+    </w:p>
+    <w:p>
+      <w:pPr>
+        <w:pStyle w:val="CodeBlock"/>
+        <w:shd w:fill="F2F4F7"/>
+      </w:pPr>
+      <w:r>
         <w:t xml:space="preserve">            if (entries is null || entries.Any(e =&gt; e is null || string.IsNullOrEmpty(e.Name) ||</w:t>
       </w:r>
     </w:p>
@@ -1844,7 +2294,34 @@
         <w:shd w:fill="F2F4F7"/>
       </w:pPr>
       <w:r>
+        <w:t xml:space="preserve">            {</w:t>
+      </w:r>
+    </w:p>
+    <w:p>
+      <w:pPr>
+        <w:pStyle w:val="CodeBlock"/>
+        <w:shd w:fill="F2F4F7"/>
+      </w:pPr>
+      <w:r>
         <w:t xml:space="preserve">                throw new InvalidDataException("The server listing contains incomplete or invalid data.");</w:t>
+      </w:r>
+    </w:p>
+    <w:p>
+      <w:pPr>
+        <w:pStyle w:val="CodeBlock"/>
+        <w:shd w:fill="F2F4F7"/>
+      </w:pPr>
+      <w:r>
+        <w:t xml:space="preserve">            }</w:t>
+      </w:r>
+    </w:p>
+    <w:p>
+      <w:pPr>
+        <w:pStyle w:val="CodeBlock"/>
+        <w:shd w:fill="F2F4F7"/>
+      </w:pPr>
+      <w:r>
+        <w:t xml:space="preserve"> </w:t>
       </w:r>
     </w:p>
     <w:p>
@@ -2038,6 +2515,15 @@
         <w:shd w:fill="F2F4F7"/>
       </w:pPr>
       <w:r>
+        <w:t xml:space="preserve">    // Error responses must not be interpreted as a listing or a ZIP package.</w:t>
+      </w:r>
+    </w:p>
+    <w:p>
+      <w:pPr>
+        <w:pStyle w:val="CodeBlock"/>
+        <w:shd w:fill="F2F4F7"/>
+      </w:pPr>
+      <w:r>
         <w:t xml:space="preserve">    private static void CheckResponse(HttpResponseMessage response)</w:t>
       </w:r>
     </w:p>
@@ -2056,7 +2542,43 @@
         <w:shd w:fill="F2F4F7"/>
       </w:pPr>
       <w:r>
-        <w:t xml:space="preserve">        if (response.IsSuccessStatusCode) return;</w:t>
+        <w:t xml:space="preserve">        if (response.IsSuccessStatusCode)</w:t>
+      </w:r>
+    </w:p>
+    <w:p>
+      <w:pPr>
+        <w:pStyle w:val="CodeBlock"/>
+        <w:shd w:fill="F2F4F7"/>
+      </w:pPr>
+      <w:r>
+        <w:t xml:space="preserve">        {</w:t>
+      </w:r>
+    </w:p>
+    <w:p>
+      <w:pPr>
+        <w:pStyle w:val="CodeBlock"/>
+        <w:shd w:fill="F2F4F7"/>
+      </w:pPr>
+      <w:r>
+        <w:t xml:space="preserve">            return;</w:t>
+      </w:r>
+    </w:p>
+    <w:p>
+      <w:pPr>
+        <w:pStyle w:val="CodeBlock"/>
+        <w:shd w:fill="F2F4F7"/>
+      </w:pPr>
+      <w:r>
+        <w:t xml:space="preserve">        }</w:t>
+      </w:r>
+    </w:p>
+    <w:p>
+      <w:pPr>
+        <w:pStyle w:val="CodeBlock"/>
+        <w:shd w:fill="F2F4F7"/>
+      </w:pPr>
+      <w:r>
+        <w:t xml:space="preserve"> </w:t>
       </w:r>
     </w:p>
     <w:p>
@@ -2120,6 +2642,15 @@
       </w:pPr>
       <w:r>
         <w:t xml:space="preserve">        };</w:t>
+      </w:r>
+    </w:p>
+    <w:p>
+      <w:pPr>
+        <w:pStyle w:val="CodeBlock"/>
+        <w:shd w:fill="F2F4F7"/>
+      </w:pPr>
+      <w:r>
+        <w:t xml:space="preserve"> </w:t>
       </w:r>
     </w:p>
     <w:p>
@@ -2255,7 +2786,52 @@
         <w:shd w:fill="F2F4F7"/>
       </w:pPr>
       <w:r>
-        <w:t xml:space="preserve">        if (value is null) return false;</w:t>
+        <w:t xml:space="preserve">        if (value is null)</w:t>
+      </w:r>
+    </w:p>
+    <w:p>
+      <w:pPr>
+        <w:pStyle w:val="CodeBlock"/>
+        <w:shd w:fill="F2F4F7"/>
+      </w:pPr>
+      <w:r>
+        <w:t xml:space="preserve">        {</w:t>
+      </w:r>
+    </w:p>
+    <w:p>
+      <w:pPr>
+        <w:pStyle w:val="CodeBlock"/>
+        <w:shd w:fill="F2F4F7"/>
+      </w:pPr>
+      <w:r>
+        <w:t xml:space="preserve">            return false;</w:t>
+      </w:r>
+    </w:p>
+    <w:p>
+      <w:pPr>
+        <w:pStyle w:val="CodeBlock"/>
+        <w:shd w:fill="F2F4F7"/>
+      </w:pPr>
+      <w:r>
+        <w:t xml:space="preserve">        }</w:t>
+      </w:r>
+    </w:p>
+    <w:p>
+      <w:pPr>
+        <w:pStyle w:val="CodeBlock"/>
+        <w:shd w:fill="F2F4F7"/>
+      </w:pPr>
+      <w:r>
+        <w:t xml:space="preserve"> </w:t>
+      </w:r>
+    </w:p>
+    <w:p>
+      <w:pPr>
+        <w:pStyle w:val="CodeBlock"/>
+        <w:shd w:fill="F2F4F7"/>
+      </w:pPr>
+      <w:r>
+        <w:t xml:space="preserve">        // Three components are required, but each can have a different digit count.</w:t>
       </w:r>
     </w:p>
     <w:p>
@@ -2273,7 +2849,52 @@
         <w:shd w:fill="F2F4F7"/>
       </w:pPr>
       <w:r>
-        <w:t xml:space="preserve">        if (parts.Length != 3) return false;</w:t>
+        <w:t xml:space="preserve">        if (parts.Length != 3)</w:t>
+      </w:r>
+    </w:p>
+    <w:p>
+      <w:pPr>
+        <w:pStyle w:val="CodeBlock"/>
+        <w:shd w:fill="F2F4F7"/>
+      </w:pPr>
+      <w:r>
+        <w:t xml:space="preserve">        {</w:t>
+      </w:r>
+    </w:p>
+    <w:p>
+      <w:pPr>
+        <w:pStyle w:val="CodeBlock"/>
+        <w:shd w:fill="F2F4F7"/>
+      </w:pPr>
+      <w:r>
+        <w:t xml:space="preserve">            return false;</w:t>
+      </w:r>
+    </w:p>
+    <w:p>
+      <w:pPr>
+        <w:pStyle w:val="CodeBlock"/>
+        <w:shd w:fill="F2F4F7"/>
+      </w:pPr>
+      <w:r>
+        <w:t xml:space="preserve">        }</w:t>
+      </w:r>
+    </w:p>
+    <w:p>
+      <w:pPr>
+        <w:pStyle w:val="CodeBlock"/>
+        <w:shd w:fill="F2F4F7"/>
+      </w:pPr>
+      <w:r>
+        <w:t xml:space="preserve"> </w:t>
+      </w:r>
+    </w:p>
+    <w:p>
+      <w:pPr>
+        <w:pStyle w:val="CodeBlock"/>
+        <w:shd w:fill="F2F4F7"/>
+      </w:pPr>
+      <w:r>
+        <w:t xml:space="preserve">        // Accept only nonnegative integer components that fit in an int.</w:t>
       </w:r>
     </w:p>
     <w:p>
@@ -2318,7 +2939,34 @@
         <w:shd w:fill="F2F4F7"/>
       </w:pPr>
       <w:r>
-        <w:t xml:space="preserve">                !int.TryParse(parts[i], NumberStyles.None, CultureInfo.InvariantCulture, out numbers[i])) return false;</w:t>
+        <w:t xml:space="preserve">                !int.TryParse(parts[i], NumberStyles.None, CultureInfo.InvariantCulture, out numbers[i]))</w:t>
+      </w:r>
+    </w:p>
+    <w:p>
+      <w:pPr>
+        <w:pStyle w:val="CodeBlock"/>
+        <w:shd w:fill="F2F4F7"/>
+      </w:pPr>
+      <w:r>
+        <w:t xml:space="preserve">            {</w:t>
+      </w:r>
+    </w:p>
+    <w:p>
+      <w:pPr>
+        <w:pStyle w:val="CodeBlock"/>
+        <w:shd w:fill="F2F4F7"/>
+      </w:pPr>
+      <w:r>
+        <w:t xml:space="preserve">                return false;</w:t>
+      </w:r>
+    </w:p>
+    <w:p>
+      <w:pPr>
+        <w:pStyle w:val="CodeBlock"/>
+        <w:shd w:fill="F2F4F7"/>
+      </w:pPr>
+      <w:r>
+        <w:t xml:space="preserve">            }</w:t>
       </w:r>
     </w:p>
     <w:p>
@@ -2449,7 +3097,43 @@
         <w:shd w:fill="F2F4F7"/>
       </w:pPr>
       <w:r>
-        <w:t xml:space="preserve">        if (result != 0) return result;</w:t>
+        <w:t xml:space="preserve">        if (result != 0)</w:t>
+      </w:r>
+    </w:p>
+    <w:p>
+      <w:pPr>
+        <w:pStyle w:val="CodeBlock"/>
+        <w:shd w:fill="F2F4F7"/>
+      </w:pPr>
+      <w:r>
+        <w:t xml:space="preserve">        {</w:t>
+      </w:r>
+    </w:p>
+    <w:p>
+      <w:pPr>
+        <w:pStyle w:val="CodeBlock"/>
+        <w:shd w:fill="F2F4F7"/>
+      </w:pPr>
+      <w:r>
+        <w:t xml:space="preserve">            return result;</w:t>
+      </w:r>
+    </w:p>
+    <w:p>
+      <w:pPr>
+        <w:pStyle w:val="CodeBlock"/>
+        <w:shd w:fill="F2F4F7"/>
+      </w:pPr>
+      <w:r>
+        <w:t xml:space="preserve">        }</w:t>
+      </w:r>
+    </w:p>
+    <w:p>
+      <w:pPr>
+        <w:pStyle w:val="CodeBlock"/>
+        <w:shd w:fill="F2F4F7"/>
+      </w:pPr>
+      <w:r>
+        <w:t xml:space="preserve"> </w:t>
       </w:r>
     </w:p>
     <w:p>
@@ -2486,6 +3170,15 @@
       </w:pPr>
       <w:r>
         <w:t xml:space="preserve"> </w:t>
+      </w:r>
+    </w:p>
+    <w:p>
+      <w:pPr>
+        <w:pStyle w:val="CodeBlock"/>
+        <w:shd w:fill="F2F4F7"/>
+      </w:pPr>
+      <w:r>
+        <w:t xml:space="preserve">    // D3 preserves the familiar display format, such as 008.000.043.</w:t>
       </w:r>
     </w:p>
     <w:p>
@@ -2626,6 +3319,15 @@
         <w:shd w:fill="F2F4F7"/>
       </w:pPr>
       <w:r>
+        <w:t xml:space="preserve"> </w:t>
+      </w:r>
+    </w:p>
+    <w:p>
+      <w:pPr>
+        <w:pStyle w:val="CodeBlock"/>
+        <w:shd w:fill="F2F4F7"/>
+      </w:pPr>
+      <w:r>
         <w:t xml:space="preserve">        var prefix = product + "_";</w:t>
       </w:r>
     </w:p>
@@ -2635,6 +3337,24 @@
         <w:shd w:fill="F2F4F7"/>
       </w:pPr>
       <w:r>
+        <w:t xml:space="preserve"> </w:t>
+      </w:r>
+    </w:p>
+    <w:p>
+      <w:pPr>
+        <w:pStyle w:val="CodeBlock"/>
+        <w:shd w:fill="F2F4F7"/>
+      </w:pPr>
+      <w:r>
+        <w:t xml:space="preserve">        // Including the separator prevents Faktury from matching FakturyExtra.</w:t>
+      </w:r>
+    </w:p>
+    <w:p>
+      <w:pPr>
+        <w:pStyle w:val="CodeBlock"/>
+        <w:shd w:fill="F2F4F7"/>
+      </w:pPr>
+      <w:r>
         <w:t xml:space="preserve">        foreach (var file in files)</w:t>
       </w:r>
     </w:p>
@@ -2671,7 +3391,52 @@
         <w:shd w:fill="F2F4F7"/>
       </w:pPr>
       <w:r>
-        <w:t xml:space="preserve">                !file.Name.EndsWith(".zip", StringComparison.OrdinalIgnoreCase)) continue;</w:t>
+        <w:t xml:space="preserve">                !file.Name.EndsWith(".zip", StringComparison.OrdinalIgnoreCase))</w:t>
+      </w:r>
+    </w:p>
+    <w:p>
+      <w:pPr>
+        <w:pStyle w:val="CodeBlock"/>
+        <w:shd w:fill="F2F4F7"/>
+      </w:pPr>
+      <w:r>
+        <w:t xml:space="preserve">            {</w:t>
+      </w:r>
+    </w:p>
+    <w:p>
+      <w:pPr>
+        <w:pStyle w:val="CodeBlock"/>
+        <w:shd w:fill="F2F4F7"/>
+      </w:pPr>
+      <w:r>
+        <w:t xml:space="preserve">                continue;</w:t>
+      </w:r>
+    </w:p>
+    <w:p>
+      <w:pPr>
+        <w:pStyle w:val="CodeBlock"/>
+        <w:shd w:fill="F2F4F7"/>
+      </w:pPr>
+      <w:r>
+        <w:t xml:space="preserve">            }</w:t>
+      </w:r>
+    </w:p>
+    <w:p>
+      <w:pPr>
+        <w:pStyle w:val="CodeBlock"/>
+        <w:shd w:fill="F2F4F7"/>
+      </w:pPr>
+      <w:r>
+        <w:t xml:space="preserve"> </w:t>
+      </w:r>
+    </w:p>
+    <w:p>
+      <w:pPr>
+        <w:pStyle w:val="CodeBlock"/>
+        <w:shd w:fill="F2F4F7"/>
+      </w:pPr>
+      <w:r>
+        <w:t xml:space="preserve">            // Remove the product prefix and the four-character .zip extension.</w:t>
       </w:r>
     </w:p>
     <w:p>
@@ -2689,7 +3454,52 @@
         <w:shd w:fill="F2F4F7"/>
       </w:pPr>
       <w:r>
-        <w:t xml:space="preserve">            if (!PackageVersion.TryParse(versionText, out var version)) continue;</w:t>
+        <w:t xml:space="preserve">            if (!PackageVersion.TryParse(versionText, out var version))</w:t>
+      </w:r>
+    </w:p>
+    <w:p>
+      <w:pPr>
+        <w:pStyle w:val="CodeBlock"/>
+        <w:shd w:fill="F2F4F7"/>
+      </w:pPr>
+      <w:r>
+        <w:t xml:space="preserve">            {</w:t>
+      </w:r>
+    </w:p>
+    <w:p>
+      <w:pPr>
+        <w:pStyle w:val="CodeBlock"/>
+        <w:shd w:fill="F2F4F7"/>
+      </w:pPr>
+      <w:r>
+        <w:t xml:space="preserve">                continue;</w:t>
+      </w:r>
+    </w:p>
+    <w:p>
+      <w:pPr>
+        <w:pStyle w:val="CodeBlock"/>
+        <w:shd w:fill="F2F4F7"/>
+      </w:pPr>
+      <w:r>
+        <w:t xml:space="preserve">            }</w:t>
+      </w:r>
+    </w:p>
+    <w:p>
+      <w:pPr>
+        <w:pStyle w:val="CodeBlock"/>
+        <w:shd w:fill="F2F4F7"/>
+      </w:pPr>
+      <w:r>
+        <w:t xml:space="preserve"> </w:t>
+      </w:r>
+    </w:p>
+    <w:p>
+      <w:pPr>
+        <w:pStyle w:val="CodeBlock"/>
+        <w:shd w:fill="F2F4F7"/>
+      </w:pPr>
+      <w:r>
+        <w:t xml:space="preserve">            // Equal versions keep the first matching entry from the listing.</w:t>
       </w:r>
     </w:p>
     <w:p>
@@ -2707,6 +3517,15 @@
         <w:shd w:fill="F2F4F7"/>
       </w:pPr>
       <w:r>
+        <w:t xml:space="preserve">            {</w:t>
+      </w:r>
+    </w:p>
+    <w:p>
+      <w:pPr>
+        <w:pStyle w:val="CodeBlock"/>
+        <w:shd w:fill="F2F4F7"/>
+      </w:pPr>
+      <w:r>
         <w:t xml:space="preserve">                newest = new(file, version);</w:t>
       </w:r>
     </w:p>
@@ -2716,7 +3535,25 @@
         <w:shd w:fill="F2F4F7"/>
       </w:pPr>
       <w:r>
+        <w:t xml:space="preserve">            }</w:t>
+      </w:r>
+    </w:p>
+    <w:p>
+      <w:pPr>
+        <w:pStyle w:val="CodeBlock"/>
+        <w:shd w:fill="F2F4F7"/>
+      </w:pPr>
+      <w:r>
         <w:t xml:space="preserve">        }</w:t>
+      </w:r>
+    </w:p>
+    <w:p>
+      <w:pPr>
+        <w:pStyle w:val="CodeBlock"/>
+        <w:shd w:fill="F2F4F7"/>
+      </w:pPr>
+      <w:r>
+        <w:t xml:space="preserve"> </w:t>
       </w:r>
     </w:p>
     <w:p>
@@ -2880,6 +3717,15 @@
         <w:shd w:fill="F2F4F7"/>
       </w:pPr>
       <w:r>
+        <w:t xml:space="preserve">    // Validate a single folder or filename, not a nested relative path.</w:t>
+      </w:r>
+    </w:p>
+    <w:p>
+      <w:pPr>
+        <w:pStyle w:val="CodeBlock"/>
+        <w:shd w:fill="F2F4F7"/>
+      </w:pPr>
+      <w:r>
         <w:t xml:space="preserve">    public static void ValidateSegment(string? value, string label)</w:t>
       </w:r>
     </w:p>
@@ -2925,6 +3771,15 @@
         <w:shd w:fill="F2F4F7"/>
       </w:pPr>
       <w:r>
+        <w:t xml:space="preserve">        {</w:t>
+      </w:r>
+    </w:p>
+    <w:p>
+      <w:pPr>
+        <w:pStyle w:val="CodeBlock"/>
+        <w:shd w:fill="F2F4F7"/>
+      </w:pPr>
+      <w:r>
         <w:t xml:space="preserve">            throw new ArgumentException($"{label}: invalid name.");</w:t>
       </w:r>
     </w:p>
@@ -2934,6 +3789,33 @@
         <w:shd w:fill="F2F4F7"/>
       </w:pPr>
       <w:r>
+        <w:t xml:space="preserve">        }</w:t>
+      </w:r>
+    </w:p>
+    <w:p>
+      <w:pPr>
+        <w:pStyle w:val="CodeBlock"/>
+        <w:shd w:fill="F2F4F7"/>
+      </w:pPr>
+      <w:r>
+        <w:t xml:space="preserve"> </w:t>
+      </w:r>
+    </w:p>
+    <w:p>
+      <w:pPr>
+        <w:pStyle w:val="CodeBlock"/>
+        <w:shd w:fill="F2F4F7"/>
+      </w:pPr>
+      <w:r>
+        <w:t xml:space="preserve">        // Windows device names remain reserved even with a file extension.</w:t>
+      </w:r>
+    </w:p>
+    <w:p>
+      <w:pPr>
+        <w:pStyle w:val="CodeBlock"/>
+        <w:shd w:fill="F2F4F7"/>
+      </w:pPr>
+      <w:r>
         <w:t xml:space="preserve">        var stem = value.Split('.')[0];</w:t>
       </w:r>
     </w:p>
@@ -2970,6 +3852,15 @@
         <w:shd w:fill="F2F4F7"/>
       </w:pPr>
       <w:r>
+        <w:t xml:space="preserve">        {</w:t>
+      </w:r>
+    </w:p>
+    <w:p>
+      <w:pPr>
+        <w:pStyle w:val="CodeBlock"/>
+        <w:shd w:fill="F2F4F7"/>
+      </w:pPr>
+      <w:r>
         <w:t xml:space="preserve">            throw new ArgumentException($"{label}: reserved name.");</w:t>
       </w:r>
     </w:p>
@@ -2979,6 +3870,15 @@
         <w:shd w:fill="F2F4F7"/>
       </w:pPr>
       <w:r>
+        <w:t xml:space="preserve">        }</w:t>
+      </w:r>
+    </w:p>
+    <w:p>
+      <w:pPr>
+        <w:pStyle w:val="CodeBlock"/>
+        <w:shd w:fill="F2F4F7"/>
+      </w:pPr>
+      <w:r>
         <w:t xml:space="preserve">    }</w:t>
       </w:r>
     </w:p>
@@ -2997,6 +3897,15 @@
         <w:shd w:fill="F2F4F7"/>
       </w:pPr>
       <w:r>
+        <w:t xml:space="preserve">    // Reject traversal and files belonging to a different client folder.</w:t>
+      </w:r>
+    </w:p>
+    <w:p>
+      <w:pPr>
+        <w:pStyle w:val="CodeBlock"/>
+        <w:shd w:fill="F2F4F7"/>
+      </w:pPr>
+      <w:r>
         <w:t xml:space="preserve">    public static void ValidatePackage(FileEntry entry, string folder)</w:t>
       </w:r>
     </w:p>
@@ -3042,7 +3951,25 @@
         <w:shd w:fill="F2F4F7"/>
       </w:pPr>
       <w:r>
+        <w:t xml:space="preserve">        {</w:t>
+      </w:r>
+    </w:p>
+    <w:p>
+      <w:pPr>
+        <w:pStyle w:val="CodeBlock"/>
+        <w:shd w:fill="F2F4F7"/>
+      </w:pPr>
+      <w:r>
         <w:t xml:space="preserve">            throw new InvalidDataException("The package does not belong to the requested folder or contains invalid data.");</w:t>
+      </w:r>
+    </w:p>
+    <w:p>
+      <w:pPr>
+        <w:pStyle w:val="CodeBlock"/>
+        <w:shd w:fill="F2F4F7"/>
+      </w:pPr>
+      <w:r>
+        <w:t xml:space="preserve">        }</w:t>
       </w:r>
     </w:p>
     <w:p>
@@ -3239,7 +4166,43 @@
         <w:shd w:fill="F2F4F7"/>
       </w:pPr>
       <w:r>
+        <w:t xml:space="preserve">        {</w:t>
+      </w:r>
+    </w:p>
+    <w:p>
+      <w:pPr>
+        <w:pStyle w:val="CodeBlock"/>
+        <w:shd w:fill="F2F4F7"/>
+      </w:pPr>
+      <w:r>
         <w:t xml:space="preserve">            throw new IOException("The destination file already exists; it will not be overwritten.");</w:t>
+      </w:r>
+    </w:p>
+    <w:p>
+      <w:pPr>
+        <w:pStyle w:val="CodeBlock"/>
+        <w:shd w:fill="F2F4F7"/>
+      </w:pPr>
+      <w:r>
+        <w:t xml:space="preserve">        }</w:t>
+      </w:r>
+    </w:p>
+    <w:p>
+      <w:pPr>
+        <w:pStyle w:val="CodeBlock"/>
+        <w:shd w:fill="F2F4F7"/>
+      </w:pPr>
+      <w:r>
+        <w:t xml:space="preserve"> </w:t>
+      </w:r>
+    </w:p>
+    <w:p>
+      <w:pPr>
+        <w:pStyle w:val="CodeBlock"/>
+        <w:shd w:fill="F2F4F7"/>
+      </w:pPr>
+      <w:r>
+        <w:t xml:space="preserve">        // A unique name lets concurrent attempts write separate temporary files.</w:t>
       </w:r>
     </w:p>
     <w:p>
@@ -3325,6 +4288,24 @@
         <w:shd w:fill="F2F4F7"/>
       </w:pPr>
       <w:r>
+        <w:t xml:space="preserve"> </w:t>
+      </w:r>
+    </w:p>
+    <w:p>
+      <w:pPr>
+        <w:pStyle w:val="CodeBlock"/>
+        <w:shd w:fill="F2F4F7"/>
+      </w:pPr>
+      <w:r>
+        <w:t xml:space="preserve">            // Stream directly to disk and prevent sharing the open temporary file.</w:t>
+      </w:r>
+    </w:p>
+    <w:p>
+      <w:pPr>
+        <w:pStyle w:val="CodeBlock"/>
+        <w:shd w:fill="F2F4F7"/>
+      </w:pPr>
+      <w:r>
         <w:t xml:space="preserve">            await using (var source = await response.Content.ReadAsStreamAsync(token))</w:t>
       </w:r>
     </w:p>
@@ -3379,6 +4360,24 @@
         <w:shd w:fill="F2F4F7"/>
       </w:pPr>
       <w:r>
+        <w:t xml:space="preserve"> </w:t>
+      </w:r>
+    </w:p>
+    <w:p>
+      <w:pPr>
+        <w:pStyle w:val="CodeBlock"/>
+        <w:shd w:fill="F2F4F7"/>
+      </w:pPr>
+      <w:r>
+        <w:t xml:space="preserve">                // Check both advertised sizes when present; either mismatch fails.</w:t>
+      </w:r>
+    </w:p>
+    <w:p>
+      <w:pPr>
+        <w:pStyle w:val="CodeBlock"/>
+        <w:shd w:fill="F2F4F7"/>
+      </w:pPr>
+      <w:r>
         <w:t xml:space="preserve">                if ((package.File.Size is long expected &amp;&amp; output.Length != expected) ||</w:t>
       </w:r>
     </w:p>
@@ -3397,7 +4396,25 @@
         <w:shd w:fill="F2F4F7"/>
       </w:pPr>
       <w:r>
+        <w:t xml:space="preserve">                {</w:t>
+      </w:r>
+    </w:p>
+    <w:p>
+      <w:pPr>
+        <w:pStyle w:val="CodeBlock"/>
+        <w:shd w:fill="F2F4F7"/>
+      </w:pPr>
+      <w:r>
         <w:t xml:space="preserve">                    throw new InvalidDataException("The downloaded size does not match the expected size.");</w:t>
+      </w:r>
+    </w:p>
+    <w:p>
+      <w:pPr>
+        <w:pStyle w:val="CodeBlock"/>
+        <w:shd w:fill="F2F4F7"/>
+      </w:pPr>
+      <w:r>
+        <w:t xml:space="preserve">                }</w:t>
       </w:r>
     </w:p>
     <w:p>
@@ -3479,6 +4496,15 @@
         <w:shd w:fill="F2F4F7"/>
       </w:pPr>
       <w:r>
+        <w:t xml:space="preserve"> </w:t>
+      </w:r>
+    </w:p>
+    <w:p>
+      <w:pPr>
+        <w:pStyle w:val="CodeBlock"/>
+        <w:shd w:fill="F2F4F7"/>
+      </w:pPr>
+      <w:r>
         <w:t xml:space="preserve">            // Same-directory move publishes only complete files, and never replaces another download.</w:t>
       </w:r>
     </w:p>
@@ -3542,25 +4568,142 @@
         <w:shd w:fill="F2F4F7"/>
       </w:pPr>
       <w:r>
-        <w:t xml:space="preserve">            try { if (File.Exists(temporary)) File.Delete(temporary); }</w:t>
-      </w:r>
-    </w:p>
-    <w:p>
-      <w:pPr>
-        <w:pStyle w:val="CodeBlock"/>
-        <w:shd w:fill="F2F4F7"/>
-      </w:pPr>
-      <w:r>
-        <w:t xml:space="preserve">            catch (IOException) { }</w:t>
-      </w:r>
-    </w:p>
-    <w:p>
-      <w:pPr>
-        <w:pStyle w:val="CodeBlock"/>
-        <w:shd w:fill="F2F4F7"/>
-      </w:pPr>
-      <w:r>
-        <w:t xml:space="preserve">            catch (UnauthorizedAccessException) { }</w:t>
+        <w:t xml:space="preserve"> </w:t>
+      </w:r>
+    </w:p>
+    <w:p>
+      <w:pPr>
+        <w:pStyle w:val="CodeBlock"/>
+        <w:shd w:fill="F2F4F7"/>
+      </w:pPr>
+      <w:r>
+        <w:t xml:space="preserve">            try</w:t>
+      </w:r>
+    </w:p>
+    <w:p>
+      <w:pPr>
+        <w:pStyle w:val="CodeBlock"/>
+        <w:shd w:fill="F2F4F7"/>
+      </w:pPr>
+      <w:r>
+        <w:t xml:space="preserve">            {</w:t>
+      </w:r>
+    </w:p>
+    <w:p>
+      <w:pPr>
+        <w:pStyle w:val="CodeBlock"/>
+        <w:shd w:fill="F2F4F7"/>
+      </w:pPr>
+      <w:r>
+        <w:t xml:space="preserve">                if (File.Exists(temporary))</w:t>
+      </w:r>
+    </w:p>
+    <w:p>
+      <w:pPr>
+        <w:pStyle w:val="CodeBlock"/>
+        <w:shd w:fill="F2F4F7"/>
+      </w:pPr>
+      <w:r>
+        <w:t xml:space="preserve">                {</w:t>
+      </w:r>
+    </w:p>
+    <w:p>
+      <w:pPr>
+        <w:pStyle w:val="CodeBlock"/>
+        <w:shd w:fill="F2F4F7"/>
+      </w:pPr>
+      <w:r>
+        <w:t xml:space="preserve">                    File.Delete(temporary);</w:t>
+      </w:r>
+    </w:p>
+    <w:p>
+      <w:pPr>
+        <w:pStyle w:val="CodeBlock"/>
+        <w:shd w:fill="F2F4F7"/>
+      </w:pPr>
+      <w:r>
+        <w:t xml:space="preserve">                }</w:t>
+      </w:r>
+    </w:p>
+    <w:p>
+      <w:pPr>
+        <w:pStyle w:val="CodeBlock"/>
+        <w:shd w:fill="F2F4F7"/>
+      </w:pPr>
+      <w:r>
+        <w:t xml:space="preserve">            }</w:t>
+      </w:r>
+    </w:p>
+    <w:p>
+      <w:pPr>
+        <w:pStyle w:val="CodeBlock"/>
+        <w:shd w:fill="F2F4F7"/>
+      </w:pPr>
+      <w:r>
+        <w:t xml:space="preserve">            catch (IOException)</w:t>
+      </w:r>
+    </w:p>
+    <w:p>
+      <w:pPr>
+        <w:pStyle w:val="CodeBlock"/>
+        <w:shd w:fill="F2F4F7"/>
+      </w:pPr>
+      <w:r>
+        <w:t xml:space="preserve">            {</w:t>
+      </w:r>
+    </w:p>
+    <w:p>
+      <w:pPr>
+        <w:pStyle w:val="CodeBlock"/>
+        <w:shd w:fill="F2F4F7"/>
+      </w:pPr>
+      <w:r>
+        <w:t xml:space="preserve">                // Leave an inaccessible temporary file rather than hide the original error.</w:t>
+      </w:r>
+    </w:p>
+    <w:p>
+      <w:pPr>
+        <w:pStyle w:val="CodeBlock"/>
+        <w:shd w:fill="F2F4F7"/>
+      </w:pPr>
+      <w:r>
+        <w:t xml:space="preserve">            }</w:t>
+      </w:r>
+    </w:p>
+    <w:p>
+      <w:pPr>
+        <w:pStyle w:val="CodeBlock"/>
+        <w:shd w:fill="F2F4F7"/>
+      </w:pPr>
+      <w:r>
+        <w:t xml:space="preserve">            catch (UnauthorizedAccessException)</w:t>
+      </w:r>
+    </w:p>
+    <w:p>
+      <w:pPr>
+        <w:pStyle w:val="CodeBlock"/>
+        <w:shd w:fill="F2F4F7"/>
+      </w:pPr>
+      <w:r>
+        <w:t xml:space="preserve">            {</w:t>
+      </w:r>
+    </w:p>
+    <w:p>
+      <w:pPr>
+        <w:pStyle w:val="CodeBlock"/>
+        <w:shd w:fill="F2F4F7"/>
+      </w:pPr>
+      <w:r>
+        <w:t xml:space="preserve">                // Cleanup is best-effort when the operating system denies deletion.</w:t>
+      </w:r>
+    </w:p>
+    <w:p>
+      <w:pPr>
+        <w:pStyle w:val="CodeBlock"/>
+        <w:shd w:fill="F2F4F7"/>
+      </w:pPr>
+      <w:r>
+        <w:t xml:space="preserve">            }</w:t>
       </w:r>
     </w:p>
     <w:p>
@@ -3627,7 +4770,43 @@
         <w:shd w:fill="F2F4F7"/>
       </w:pPr>
       <w:r>
-        <w:t xml:space="preserve">        if (archive.Entries.Count == 0) throw new InvalidDataException("The ZIP archive contains no files.");</w:t>
+        <w:t xml:space="preserve">        if (archive.Entries.Count == 0)</w:t>
+      </w:r>
+    </w:p>
+    <w:p>
+      <w:pPr>
+        <w:pStyle w:val="CodeBlock"/>
+        <w:shd w:fill="F2F4F7"/>
+      </w:pPr>
+      <w:r>
+        <w:t xml:space="preserve">        {</w:t>
+      </w:r>
+    </w:p>
+    <w:p>
+      <w:pPr>
+        <w:pStyle w:val="CodeBlock"/>
+        <w:shd w:fill="F2F4F7"/>
+      </w:pPr>
+      <w:r>
+        <w:t xml:space="preserve">            throw new InvalidDataException("The ZIP archive contains no files.");</w:t>
+      </w:r>
+    </w:p>
+    <w:p>
+      <w:pPr>
+        <w:pStyle w:val="CodeBlock"/>
+        <w:shd w:fill="F2F4F7"/>
+      </w:pPr>
+      <w:r>
+        <w:t xml:space="preserve">        }</w:t>
+      </w:r>
+    </w:p>
+    <w:p>
+      <w:pPr>
+        <w:pStyle w:val="CodeBlock"/>
+        <w:shd w:fill="F2F4F7"/>
+      </w:pPr>
+      <w:r>
+        <w:t xml:space="preserve"> </w:t>
       </w:r>
     </w:p>
     <w:p>
@@ -3962,6 +5141,24 @@
         <w:shd w:fill="F2F4F7"/>
       </w:pPr>
       <w:r>
+        <w:t xml:space="preserve"> </w:t>
+      </w:r>
+    </w:p>
+    <w:p>
+      <w:pPr>
+        <w:pStyle w:val="CodeBlock"/>
+        <w:shd w:fill="F2F4F7"/>
+      </w:pPr>
+      <w:r>
+        <w:t xml:space="preserve">    // No real request is made to demo.invalid when DemoHandler is injected.</w:t>
+      </w:r>
+    </w:p>
+    <w:p>
+      <w:pPr>
+        <w:pStyle w:val="CodeBlock"/>
+        <w:shd w:fill="F2F4F7"/>
+      </w:pPr>
+      <w:r>
         <w:t xml:space="preserve">    var baseUrl = demo ? "https://demo.invalid/SQLupdate/" :</w:t>
       </w:r>
     </w:p>
@@ -4091,7 +5288,70 @@
         <w:shd w:fill="F2F4F7"/>
       </w:pPr>
       <w:r>
-        <w:t xml:space="preserve">    return result.Status switch { UpdateStatus.Error =&gt; 1, UpdateStatus.Cancelled =&gt; 130, _ =&gt; 0 };</w:t>
+        <w:t xml:space="preserve"> </w:t>
+      </w:r>
+    </w:p>
+    <w:p>
+      <w:pPr>
+        <w:pStyle w:val="CodeBlock"/>
+        <w:shd w:fill="F2F4F7"/>
+      </w:pPr>
+      <w:r>
+        <w:t xml:space="preserve">    // Exit codes allow a calling script to distinguish failure and cancellation.</w:t>
+      </w:r>
+    </w:p>
+    <w:p>
+      <w:pPr>
+        <w:pStyle w:val="CodeBlock"/>
+        <w:shd w:fill="F2F4F7"/>
+      </w:pPr>
+      <w:r>
+        <w:t xml:space="preserve">    return result.Status switch</w:t>
+      </w:r>
+    </w:p>
+    <w:p>
+      <w:pPr>
+        <w:pStyle w:val="CodeBlock"/>
+        <w:shd w:fill="F2F4F7"/>
+      </w:pPr>
+      <w:r>
+        <w:t xml:space="preserve">    {</w:t>
+      </w:r>
+    </w:p>
+    <w:p>
+      <w:pPr>
+        <w:pStyle w:val="CodeBlock"/>
+        <w:shd w:fill="F2F4F7"/>
+      </w:pPr>
+      <w:r>
+        <w:t xml:space="preserve">        UpdateStatus.Error =&gt; 1,</w:t>
+      </w:r>
+    </w:p>
+    <w:p>
+      <w:pPr>
+        <w:pStyle w:val="CodeBlock"/>
+        <w:shd w:fill="F2F4F7"/>
+      </w:pPr>
+      <w:r>
+        <w:t xml:space="preserve">        UpdateStatus.Cancelled =&gt; 130,</w:t>
+      </w:r>
+    </w:p>
+    <w:p>
+      <w:pPr>
+        <w:pStyle w:val="CodeBlock"/>
+        <w:shd w:fill="F2F4F7"/>
+      </w:pPr>
+      <w:r>
+        <w:t xml:space="preserve">        _ =&gt; 0</w:t>
+      </w:r>
+    </w:p>
+    <w:p>
+      <w:pPr>
+        <w:pStyle w:val="CodeBlock"/>
+        <w:shd w:fill="F2F4F7"/>
+      </w:pPr>
+      <w:r>
+        <w:t xml:space="preserve">    };</w:t>
       </w:r>
     </w:p>
     <w:p>
@@ -4145,7 +5405,43 @@
         <w:shd w:fill="F2F4F7"/>
       </w:pPr>
       <w:r>
-        <w:t>ConsoleCancelEventHandler cancel = (_, e) =&gt; { e.Cancel = true; cancellation.Cancel(); };</w:t>
+        <w:t>ConsoleCancelEventHandler cancel = (_, e) =&gt;</w:t>
+      </w:r>
+    </w:p>
+    <w:p>
+      <w:pPr>
+        <w:pStyle w:val="CodeBlock"/>
+        <w:shd w:fill="F2F4F7"/>
+      </w:pPr>
+      <w:r>
+        <w:t>{</w:t>
+      </w:r>
+    </w:p>
+    <w:p>
+      <w:pPr>
+        <w:pStyle w:val="CodeBlock"/>
+        <w:shd w:fill="F2F4F7"/>
+      </w:pPr>
+      <w:r>
+        <w:t xml:space="preserve">    e.Cancel = true;</w:t>
+      </w:r>
+    </w:p>
+    <w:p>
+      <w:pPr>
+        <w:pStyle w:val="CodeBlock"/>
+        <w:shd w:fill="F2F4F7"/>
+      </w:pPr>
+      <w:r>
+        <w:t xml:space="preserve">    cancellation.Cancel();</w:t>
+      </w:r>
+    </w:p>
+    <w:p>
+      <w:pPr>
+        <w:pStyle w:val="CodeBlock"/>
+        <w:shd w:fill="F2F4F7"/>
+      </w:pPr>
+      <w:r>
+        <w:t>};</w:t>
       </w:r>
     </w:p>
     <w:p>
@@ -4226,6 +5522,24 @@
         <w:shd w:fill="F2F4F7"/>
       </w:pPr>
       <w:r>
+        <w:t xml:space="preserve"> </w:t>
+      </w:r>
+    </w:p>
+    <w:p>
+      <w:pPr>
+        <w:pStyle w:val="CodeBlock"/>
+        <w:shd w:fill="F2F4F7"/>
+      </w:pPr>
+      <w:r>
+        <w:t xml:space="preserve">        // api.php returns JSON; the download request returns the sample ZIP.</w:t>
+      </w:r>
+    </w:p>
+    <w:p>
+      <w:pPr>
+        <w:pStyle w:val="CodeBlock"/>
+        <w:shd w:fill="F2F4F7"/>
+      </w:pPr>
+      <w:r>
         <w:t xml:space="preserve">        HttpContent content = request.RequestUri!.AbsolutePath.EndsWith("api.php", StringComparison.Ordinal)</w:t>
       </w:r>
     </w:p>
@@ -4254,6 +5568,15 @@
       </w:pPr>
       <w:r>
         <w:t xml:space="preserve">            : new ByteArrayContent(package);</w:t>
+      </w:r>
+    </w:p>
+    <w:p>
+      <w:pPr>
+        <w:pStyle w:val="CodeBlock"/>
+        <w:shd w:fill="F2F4F7"/>
+      </w:pPr>
+      <w:r>
+        <w:t xml:space="preserve"> </w:t>
       </w:r>
     </w:p>
     <w:p>

</xml_diff>

<commit_message>
Crear la API PHP y el endpoint de descarga de actualizaciones
</commit_message>
<xml_diff>
--- a/docs/technical-walkthrough.docx
+++ b/docs/technical-walkthrough.docx
@@ -12,7 +12,7 @@
     </w:p>
     <w:p>
       <w:r>
-        <w:t>Date: October 5, 2026.</w:t>
+        <w:t>Date: October 6, 2026.</w:t>
       </w:r>
     </w:p>
     <w:p>
@@ -22,7 +22,7 @@
     </w:p>
     <w:p>
       <w:r>
-        <w:t>This guide explains the current implementation, with excerpts copied from its C# source files. Excerpts may omit surrounding declarations and are not all standalone programs. The integration example uses placeholder variables provided by Tytan.</w:t>
+        <w:t>This guide explains the client and PHP server implementation, with excerpts copied from their source files. Excerpts may omit surrounding declarations and are not all standalone programs. The integration example uses placeholder variables provided by Tytan.</w:t>
       </w:r>
     </w:p>
     <w:p>
@@ -45,7 +45,7 @@
     </w:p>
     <w:p>
       <w:r>
-        <w:t>The live request to the documented listing endpoint returned HTTP 404 on October 5. Local tests validate the documented contract, not the live server or installation inside Tytan.</w:t>
+        <w:t>The live listing request returned HTTP 404 on October 5. On October 6, the scope was corrected to include creating the PHP endpoints. They now work with the C# client in local integration tests, but have not been published to the hosting server. Installation inside Tytan remains outside this repository.</w:t>
       </w:r>
     </w:p>
     <w:p>
@@ -90,6 +90,118 @@
                 <w:b/>
               </w:rPr>
               <w:t>Responsibility</w:t>
+            </w:r>
+          </w:p>
+        </w:tc>
+      </w:tr>
+      <w:tr>
+        <w:tc>
+          <w:tcPr>
+            <w:tcW w:type="dxa" w:w="4933"/>
+          </w:tcPr>
+          <w:p>
+            <w:r/>
+            <w:r>
+              <w:rPr>
+                <w:rFonts w:ascii="Consolas" w:hAnsi="Consolas"/>
+                <w:sz w:val="18"/>
+              </w:rPr>
+              <w:t>server/api.php</w:t>
+            </w:r>
+            <w:r/>
+          </w:p>
+        </w:tc>
+        <w:tc>
+          <w:tcPr>
+            <w:tcW w:type="dxa" w:w="4933"/>
+          </w:tcPr>
+          <w:p>
+            <w:r>
+              <w:t>List client folders and ZIP packages as JSON</w:t>
+            </w:r>
+          </w:p>
+        </w:tc>
+      </w:tr>
+      <w:tr>
+        <w:tc>
+          <w:tcPr>
+            <w:tcW w:type="dxa" w:w="4933"/>
+          </w:tcPr>
+          <w:p>
+            <w:r/>
+            <w:r>
+              <w:rPr>
+                <w:rFonts w:ascii="Consolas" w:hAnsi="Consolas"/>
+                <w:sz w:val="18"/>
+              </w:rPr>
+              <w:t>server/download.php</w:t>
+            </w:r>
+            <w:r/>
+          </w:p>
+        </w:tc>
+        <w:tc>
+          <w:tcPr>
+            <w:tcW w:type="dxa" w:w="4933"/>
+          </w:tcPr>
+          <w:p>
+            <w:r>
+              <w:t>Stream a selected ZIP package</w:t>
+            </w:r>
+          </w:p>
+        </w:tc>
+      </w:tr>
+      <w:tr>
+        <w:tc>
+          <w:tcPr>
+            <w:tcW w:type="dxa" w:w="4933"/>
+          </w:tcPr>
+          <w:p>
+            <w:r/>
+            <w:r>
+              <w:rPr>
+                <w:rFonts w:ascii="Consolas" w:hAnsi="Consolas"/>
+                <w:sz w:val="18"/>
+              </w:rPr>
+              <w:t>server/common.php</w:t>
+            </w:r>
+            <w:r/>
+          </w:p>
+        </w:tc>
+        <w:tc>
+          <w:tcPr>
+            <w:tcW w:type="dxa" w:w="4933"/>
+          </w:tcPr>
+          <w:p>
+            <w:r>
+              <w:t>Authentication, HTTPS, path validation, and error responses</w:t>
+            </w:r>
+          </w:p>
+        </w:tc>
+      </w:tr>
+      <w:tr>
+        <w:tc>
+          <w:tcPr>
+            <w:tcW w:type="dxa" w:w="4933"/>
+          </w:tcPr>
+          <w:p>
+            <w:r/>
+            <w:r>
+              <w:rPr>
+                <w:rFonts w:ascii="Consolas" w:hAnsi="Consolas"/>
+                <w:sz w:val="18"/>
+              </w:rPr>
+              <w:t>tests/server/test_endpoints.py</w:t>
+            </w:r>
+            <w:r/>
+          </w:p>
+        </w:tc>
+        <w:tc>
+          <w:tcPr>
+            <w:tcW w:type="dxa" w:w="4933"/>
+          </w:tcPr>
+          <w:p>
+            <w:r>
+              <w:t>Exercise actual PHP with temporary fixtures and optional C# integration</w:t>
             </w:r>
           </w:p>
         </w:tc>
@@ -6088,7 +6200,7 @@
         <w:pStyle w:val="ListBullet"/>
       </w:pPr>
       <w:r>
-        <w:t>Confirm the exact API and download paths because the documented listing URL returned HTTP 404.</w:t>
+        <w:t>Deploy the three PHP files to SQLupdate and configure HTTPS and BasicAuth; the new endpoints have not been published yet.</w:t>
       </w:r>
     </w:p>
     <w:p>
@@ -6096,7 +6208,7 @@
         <w:pStyle w:val="ListBullet"/>
       </w:pPr>
       <w:r>
-        <w:t>Validate the actual JSON and package naming against the production server before claiming live compatibility.</w:t>
+        <w:t>Validate the deployed JSON and package naming against production; local PHP/C# integration passes but does not validate hosting.</w:t>
       </w:r>
     </w:p>
     <w:p>
@@ -6142,6 +6254,1173 @@
     <w:p>
       <w:r>
         <w:t>Suggested reading order: Models.cs, UpdateService.cs, UpdateApiClient.cs, PackageSelector.cs, PackageVersion.cs, PackageDownload.cs, then the CLI and tests.</w:t>
+      </w:r>
+    </w:p>
+    <w:p>
+      <w:pPr>
+        <w:pStyle w:val="Heading1"/>
+      </w:pPr>
+      <w:r>
+        <w:t>17. PHP server - listing and downloading</w:t>
+      </w:r>
+    </w:p>
+    <w:p>
+      <w:r>
+        <w:t>The PHP implementation is the server half of the contract. api.php lists folders and ZIP packages; download.php streams a selected ZIP. common.php shares authentication, HTTPS checks, canonical-path validation, and JSON error handling. The C# module still selects versions and Tytan still installs packages.</w:t>
+      </w:r>
+    </w:p>
+    <w:p>
+      <w:pPr>
+        <w:pStyle w:val="Heading2"/>
+      </w:pPr>
+      <w:r>
+        <w:t>Listing a client folder</w:t>
+      </w:r>
+    </w:p>
+    <w:p>
+      <w:r>
+        <w:t xml:space="preserve">Source: </w:t>
+      </w:r>
+      <w:r>
+        <w:rPr>
+          <w:rFonts w:ascii="Consolas" w:hAnsi="Consolas"/>
+          <w:sz w:val="18"/>
+        </w:rPr>
+        <w:t>server/api.php</w:t>
+      </w:r>
+      <w:r/>
+    </w:p>
+    <w:p>
+      <w:pPr>
+        <w:pStyle w:val="CodeBlock"/>
+        <w:shd w:fill="F2F4F7"/>
+      </w:pPr>
+      <w:r>
+        <w:t>&lt;?php</w:t>
+      </w:r>
+    </w:p>
+    <w:p>
+      <w:pPr>
+        <w:pStyle w:val="CodeBlock"/>
+        <w:shd w:fill="F2F4F7"/>
+      </w:pPr>
+      <w:r>
+        <w:t>declare(strict_types=1);</w:t>
+      </w:r>
+    </w:p>
+    <w:p>
+      <w:pPr>
+        <w:pStyle w:val="CodeBlock"/>
+        <w:shd w:fill="F2F4F7"/>
+      </w:pPr>
+      <w:r>
+        <w:t xml:space="preserve"> </w:t>
+      </w:r>
+    </w:p>
+    <w:p>
+      <w:pPr>
+        <w:pStyle w:val="CodeBlock"/>
+        <w:shd w:fill="F2F4F7"/>
+      </w:pPr>
+      <w:r>
+        <w:t>define('TYTAN_ENDPOINT', true);</w:t>
+      </w:r>
+    </w:p>
+    <w:p>
+      <w:pPr>
+        <w:pStyle w:val="CodeBlock"/>
+        <w:shd w:fill="F2F4F7"/>
+      </w:pPr>
+      <w:r>
+        <w:t>require __DIR__ . '/common.php';</w:t>
+      </w:r>
+    </w:p>
+    <w:p>
+      <w:pPr>
+        <w:pStyle w:val="CodeBlock"/>
+        <w:shd w:fill="F2F4F7"/>
+      </w:pPr>
+      <w:r>
+        <w:t xml:space="preserve"> </w:t>
+      </w:r>
+    </w:p>
+    <w:p>
+      <w:pPr>
+        <w:pStyle w:val="CodeBlock"/>
+        <w:shd w:fill="F2F4F7"/>
+      </w:pPr>
+      <w:r>
+        <w:t>$base = bootstrap();</w:t>
+      </w:r>
+    </w:p>
+    <w:p>
+      <w:pPr>
+        <w:pStyle w:val="CodeBlock"/>
+        <w:shd w:fill="F2F4F7"/>
+      </w:pPr>
+      <w:r>
+        <w:t>$relative = query_path('dir', true);</w:t>
+      </w:r>
+    </w:p>
+    <w:p>
+      <w:pPr>
+        <w:pStyle w:val="CodeBlock"/>
+        <w:shd w:fill="F2F4F7"/>
+      </w:pPr>
+      <w:r>
+        <w:t>$target = resolve_target($base, $relative);</w:t>
+      </w:r>
+    </w:p>
+    <w:p>
+      <w:pPr>
+        <w:pStyle w:val="CodeBlock"/>
+        <w:shd w:fill="F2F4F7"/>
+      </w:pPr>
+      <w:r>
+        <w:t xml:space="preserve"> </w:t>
+      </w:r>
+    </w:p>
+    <w:p>
+      <w:pPr>
+        <w:pStyle w:val="CodeBlock"/>
+        <w:shd w:fill="F2F4F7"/>
+      </w:pPr>
+      <w:r>
+        <w:t>if (!is_dir($target) || !is_readable($target)) {</w:t>
+      </w:r>
+    </w:p>
+    <w:p>
+      <w:pPr>
+        <w:pStyle w:val="CodeBlock"/>
+        <w:shd w:fill="F2F4F7"/>
+      </w:pPr>
+      <w:r>
+        <w:t xml:space="preserve">    fail_request(404, 'Directory not found or not readable.');</w:t>
+      </w:r>
+    </w:p>
+    <w:p>
+      <w:pPr>
+        <w:pStyle w:val="CodeBlock"/>
+        <w:shd w:fill="F2F4F7"/>
+      </w:pPr>
+      <w:r>
+        <w:t>}</w:t>
+      </w:r>
+    </w:p>
+    <w:p>
+      <w:pPr>
+        <w:pStyle w:val="CodeBlock"/>
+        <w:shd w:fill="F2F4F7"/>
+      </w:pPr>
+      <w:r>
+        <w:t xml:space="preserve"> </w:t>
+      </w:r>
+    </w:p>
+    <w:p>
+      <w:pPr>
+        <w:pStyle w:val="CodeBlock"/>
+        <w:shd w:fill="F2F4F7"/>
+      </w:pPr>
+      <w:r>
+        <w:t>$items = scandir($target);</w:t>
+      </w:r>
+    </w:p>
+    <w:p>
+      <w:pPr>
+        <w:pStyle w:val="CodeBlock"/>
+        <w:shd w:fill="F2F4F7"/>
+      </w:pPr>
+      <w:r>
+        <w:t>if ($items === false) {</w:t>
+      </w:r>
+    </w:p>
+    <w:p>
+      <w:pPr>
+        <w:pStyle w:val="CodeBlock"/>
+        <w:shd w:fill="F2F4F7"/>
+      </w:pPr>
+      <w:r>
+        <w:t xml:space="preserve">    fail_request(500, 'The directory could not be listed.');</w:t>
+      </w:r>
+    </w:p>
+    <w:p>
+      <w:pPr>
+        <w:pStyle w:val="CodeBlock"/>
+        <w:shd w:fill="F2F4F7"/>
+      </w:pPr>
+      <w:r>
+        <w:t>}</w:t>
+      </w:r>
+    </w:p>
+    <w:p>
+      <w:pPr>
+        <w:pStyle w:val="CodeBlock"/>
+        <w:shd w:fill="F2F4F7"/>
+      </w:pPr>
+      <w:r>
+        <w:t xml:space="preserve"> </w:t>
+      </w:r>
+    </w:p>
+    <w:p>
+      <w:pPr>
+        <w:pStyle w:val="CodeBlock"/>
+        <w:shd w:fill="F2F4F7"/>
+      </w:pPr>
+      <w:r>
+        <w:t>$result = [];</w:t>
+      </w:r>
+    </w:p>
+    <w:p>
+      <w:pPr>
+        <w:pStyle w:val="CodeBlock"/>
+        <w:shd w:fill="F2F4F7"/>
+      </w:pPr>
+      <w:r>
+        <w:t>foreach ($items as $name) {</w:t>
+      </w:r>
+    </w:p>
+    <w:p>
+      <w:pPr>
+        <w:pStyle w:val="CodeBlock"/>
+        <w:shd w:fill="F2F4F7"/>
+      </w:pPr>
+      <w:r>
+        <w:t xml:space="preserve">    // Publish folders and ZIP packages, never PHP source, configuration or dotfiles.</w:t>
+      </w:r>
+    </w:p>
+    <w:p>
+      <w:pPr>
+        <w:pStyle w:val="CodeBlock"/>
+        <w:shd w:fill="F2F4F7"/>
+      </w:pPr>
+      <w:r>
+        <w:t xml:space="preserve">    if (!public_name($name)) {</w:t>
+      </w:r>
+    </w:p>
+    <w:p>
+      <w:pPr>
+        <w:pStyle w:val="CodeBlock"/>
+        <w:shd w:fill="F2F4F7"/>
+      </w:pPr>
+      <w:r>
+        <w:t xml:space="preserve">        continue;</w:t>
+      </w:r>
+    </w:p>
+    <w:p>
+      <w:pPr>
+        <w:pStyle w:val="CodeBlock"/>
+        <w:shd w:fill="F2F4F7"/>
+      </w:pPr>
+      <w:r>
+        <w:t xml:space="preserve">    }</w:t>
+      </w:r>
+    </w:p>
+    <w:p>
+      <w:pPr>
+        <w:pStyle w:val="CodeBlock"/>
+        <w:shd w:fill="F2F4F7"/>
+      </w:pPr>
+      <w:r>
+        <w:t xml:space="preserve"> </w:t>
+      </w:r>
+    </w:p>
+    <w:p>
+      <w:pPr>
+        <w:pStyle w:val="CodeBlock"/>
+        <w:shd w:fill="F2F4F7"/>
+      </w:pPr>
+      <w:r>
+        <w:t xml:space="preserve">    $path = realpath($target . DIRECTORY_SEPARATOR . $name);</w:t>
+      </w:r>
+    </w:p>
+    <w:p>
+      <w:pPr>
+        <w:pStyle w:val="CodeBlock"/>
+        <w:shd w:fill="F2F4F7"/>
+      </w:pPr>
+      <w:r>
+        <w:t xml:space="preserve">    if ($path === false || !inside_root($path, $base) || !is_readable($path)) {</w:t>
+      </w:r>
+    </w:p>
+    <w:p>
+      <w:pPr>
+        <w:pStyle w:val="CodeBlock"/>
+        <w:shd w:fill="F2F4F7"/>
+      </w:pPr>
+      <w:r>
+        <w:t xml:space="preserve">        continue;</w:t>
+      </w:r>
+    </w:p>
+    <w:p>
+      <w:pPr>
+        <w:pStyle w:val="CodeBlock"/>
+        <w:shd w:fill="F2F4F7"/>
+      </w:pPr>
+      <w:r>
+        <w:t xml:space="preserve">    }</w:t>
+      </w:r>
+    </w:p>
+    <w:p>
+      <w:pPr>
+        <w:pStyle w:val="CodeBlock"/>
+        <w:shd w:fill="F2F4F7"/>
+      </w:pPr>
+      <w:r>
+        <w:t xml:space="preserve"> </w:t>
+      </w:r>
+    </w:p>
+    <w:p>
+      <w:pPr>
+        <w:pStyle w:val="CodeBlock"/>
+        <w:shd w:fill="F2F4F7"/>
+      </w:pPr>
+      <w:r>
+        <w:t xml:space="preserve">    $folder = is_dir($path);</w:t>
+      </w:r>
+    </w:p>
+    <w:p>
+      <w:pPr>
+        <w:pStyle w:val="CodeBlock"/>
+        <w:shd w:fill="F2F4F7"/>
+      </w:pPr>
+      <w:r>
+        <w:t xml:space="preserve">    if (!$folder &amp;&amp; (!is_file($path) || strtolower(pathinfo($name, PATHINFO_EXTENSION)) !== 'zip')) {</w:t>
+      </w:r>
+    </w:p>
+    <w:p>
+      <w:pPr>
+        <w:pStyle w:val="CodeBlock"/>
+        <w:shd w:fill="F2F4F7"/>
+      </w:pPr>
+      <w:r>
+        <w:t xml:space="preserve">        continue;</w:t>
+      </w:r>
+    </w:p>
+    <w:p>
+      <w:pPr>
+        <w:pStyle w:val="CodeBlock"/>
+        <w:shd w:fill="F2F4F7"/>
+      </w:pPr>
+      <w:r>
+        <w:t xml:space="preserve">    }</w:t>
+      </w:r>
+    </w:p>
+    <w:p>
+      <w:pPr>
+        <w:pStyle w:val="CodeBlock"/>
+        <w:shd w:fill="F2F4F7"/>
+      </w:pPr>
+      <w:r>
+        <w:t xml:space="preserve"> </w:t>
+      </w:r>
+    </w:p>
+    <w:p>
+      <w:pPr>
+        <w:pStyle w:val="CodeBlock"/>
+        <w:shd w:fill="F2F4F7"/>
+      </w:pPr>
+      <w:r>
+        <w:t xml:space="preserve">    $size = $folder ? null : filesize($path);</w:t>
+      </w:r>
+    </w:p>
+    <w:p>
+      <w:pPr>
+        <w:pStyle w:val="CodeBlock"/>
+        <w:shd w:fill="F2F4F7"/>
+      </w:pPr>
+      <w:r>
+        <w:t xml:space="preserve">    $modified = filemtime($path);</w:t>
+      </w:r>
+    </w:p>
+    <w:p>
+      <w:pPr>
+        <w:pStyle w:val="CodeBlock"/>
+        <w:shd w:fill="F2F4F7"/>
+      </w:pPr>
+      <w:r>
+        <w:t xml:space="preserve">    if ($size === false || $modified === false) {</w:t>
+      </w:r>
+    </w:p>
+    <w:p>
+      <w:pPr>
+        <w:pStyle w:val="CodeBlock"/>
+        <w:shd w:fill="F2F4F7"/>
+      </w:pPr>
+      <w:r>
+        <w:t xml:space="preserve">        fail_request(500, 'Package metadata could not be read.');</w:t>
+      </w:r>
+    </w:p>
+    <w:p>
+      <w:pPr>
+        <w:pStyle w:val="CodeBlock"/>
+        <w:shd w:fill="F2F4F7"/>
+      </w:pPr>
+      <w:r>
+        <w:t xml:space="preserve">    }</w:t>
+      </w:r>
+    </w:p>
+    <w:p>
+      <w:pPr>
+        <w:pStyle w:val="CodeBlock"/>
+        <w:shd w:fill="F2F4F7"/>
+      </w:pPr>
+      <w:r>
+        <w:t xml:space="preserve"> </w:t>
+      </w:r>
+    </w:p>
+    <w:p>
+      <w:pPr>
+        <w:pStyle w:val="CodeBlock"/>
+        <w:shd w:fill="F2F4F7"/>
+      </w:pPr>
+      <w:r>
+        <w:t xml:space="preserve">    // Match the lowercase JSON contract used by FileEntry in the C# client.</w:t>
+      </w:r>
+    </w:p>
+    <w:p>
+      <w:pPr>
+        <w:pStyle w:val="CodeBlock"/>
+        <w:shd w:fill="F2F4F7"/>
+      </w:pPr>
+      <w:r>
+        <w:t xml:space="preserve">    $result[] = [</w:t>
+      </w:r>
+    </w:p>
+    <w:p>
+      <w:pPr>
+        <w:pStyle w:val="CodeBlock"/>
+        <w:shd w:fill="F2F4F7"/>
+      </w:pPr>
+      <w:r>
+        <w:t xml:space="preserve">        'name' =&gt; $name,</w:t>
+      </w:r>
+    </w:p>
+    <w:p>
+      <w:pPr>
+        <w:pStyle w:val="CodeBlock"/>
+        <w:shd w:fill="F2F4F7"/>
+      </w:pPr>
+      <w:r>
+        <w:t xml:space="preserve">        'type' =&gt; $folder ? 'folder' : 'file',</w:t>
+      </w:r>
+    </w:p>
+    <w:p>
+      <w:pPr>
+        <w:pStyle w:val="CodeBlock"/>
+        <w:shd w:fill="F2F4F7"/>
+      </w:pPr>
+      <w:r>
+        <w:t xml:space="preserve">        'size' =&gt; $size,</w:t>
+      </w:r>
+    </w:p>
+    <w:p>
+      <w:pPr>
+        <w:pStyle w:val="CodeBlock"/>
+        <w:shd w:fill="F2F4F7"/>
+      </w:pPr>
+      <w:r>
+        <w:t xml:space="preserve">        'modified' =&gt; gmdate('Y-m-d H:i:s', $modified),</w:t>
+      </w:r>
+    </w:p>
+    <w:p>
+      <w:pPr>
+        <w:pStyle w:val="CodeBlock"/>
+        <w:shd w:fill="F2F4F7"/>
+      </w:pPr>
+      <w:r>
+        <w:t xml:space="preserve">        'path' =&gt; ($relative === '' ? '' : $relative . '/') . $name,</w:t>
+      </w:r>
+    </w:p>
+    <w:p>
+      <w:pPr>
+        <w:pStyle w:val="CodeBlock"/>
+        <w:shd w:fill="F2F4F7"/>
+      </w:pPr>
+      <w:r>
+        <w:t xml:space="preserve">    ];</w:t>
+      </w:r>
+    </w:p>
+    <w:p>
+      <w:pPr>
+        <w:pStyle w:val="CodeBlock"/>
+        <w:shd w:fill="F2F4F7"/>
+      </w:pPr>
+      <w:r>
+        <w:t>}</w:t>
+      </w:r>
+    </w:p>
+    <w:p>
+      <w:pPr>
+        <w:pStyle w:val="CodeBlock"/>
+        <w:shd w:fill="F2F4F7"/>
+      </w:pPr>
+      <w:r>
+        <w:t xml:space="preserve"> </w:t>
+      </w:r>
+    </w:p>
+    <w:p>
+      <w:pPr>
+        <w:pStyle w:val="CodeBlock"/>
+        <w:shd w:fill="F2F4F7"/>
+      </w:pPr>
+      <w:r>
+        <w:t>send_json($result);</w:t>
+      </w:r>
+    </w:p>
+    <w:p>
+      <w:r>
+        <w:t>bootstrap() checks request method, HTTPS, authentication, and the update root. query_path() validates the relative directory; resolve_target() resolves it and verifies containment. The endpoint excludes hidden and non-package files, then returns the lowercase fields expected by FileEntry. Dates are UTC and do not decide which version the client downloads.</w:t>
+      </w:r>
+    </w:p>
+    <w:p>
+      <w:pPr>
+        <w:pStyle w:val="Heading2"/>
+      </w:pPr>
+      <w:r>
+        <w:t>Downloading package bytes</w:t>
+      </w:r>
+    </w:p>
+    <w:p>
+      <w:r>
+        <w:t xml:space="preserve">Source: </w:t>
+      </w:r>
+      <w:r>
+        <w:rPr>
+          <w:rFonts w:ascii="Consolas" w:hAnsi="Consolas"/>
+          <w:sz w:val="18"/>
+        </w:rPr>
+        <w:t>server/download.php</w:t>
+      </w:r>
+      <w:r/>
+    </w:p>
+    <w:p>
+      <w:pPr>
+        <w:pStyle w:val="CodeBlock"/>
+        <w:shd w:fill="F2F4F7"/>
+      </w:pPr>
+      <w:r>
+        <w:t>&lt;?php</w:t>
+      </w:r>
+    </w:p>
+    <w:p>
+      <w:pPr>
+        <w:pStyle w:val="CodeBlock"/>
+        <w:shd w:fill="F2F4F7"/>
+      </w:pPr>
+      <w:r>
+        <w:t>declare(strict_types=1);</w:t>
+      </w:r>
+    </w:p>
+    <w:p>
+      <w:pPr>
+        <w:pStyle w:val="CodeBlock"/>
+        <w:shd w:fill="F2F4F7"/>
+      </w:pPr>
+      <w:r>
+        <w:t xml:space="preserve"> </w:t>
+      </w:r>
+    </w:p>
+    <w:p>
+      <w:pPr>
+        <w:pStyle w:val="CodeBlock"/>
+        <w:shd w:fill="F2F4F7"/>
+      </w:pPr>
+      <w:r>
+        <w:t>define('TYTAN_ENDPOINT', true);</w:t>
+      </w:r>
+    </w:p>
+    <w:p>
+      <w:pPr>
+        <w:pStyle w:val="CodeBlock"/>
+        <w:shd w:fill="F2F4F7"/>
+      </w:pPr>
+      <w:r>
+        <w:t>require __DIR__ . '/common.php';</w:t>
+      </w:r>
+    </w:p>
+    <w:p>
+      <w:pPr>
+        <w:pStyle w:val="CodeBlock"/>
+        <w:shd w:fill="F2F4F7"/>
+      </w:pPr>
+      <w:r>
+        <w:t xml:space="preserve"> </w:t>
+      </w:r>
+    </w:p>
+    <w:p>
+      <w:pPr>
+        <w:pStyle w:val="CodeBlock"/>
+        <w:shd w:fill="F2F4F7"/>
+      </w:pPr>
+      <w:r>
+        <w:t>$base = bootstrap();</w:t>
+      </w:r>
+    </w:p>
+    <w:p>
+      <w:pPr>
+        <w:pStyle w:val="CodeBlock"/>
+        <w:shd w:fill="F2F4F7"/>
+      </w:pPr>
+      <w:r>
+        <w:t>$relative = query_path('file', false);</w:t>
+      </w:r>
+    </w:p>
+    <w:p>
+      <w:pPr>
+        <w:pStyle w:val="CodeBlock"/>
+        <w:shd w:fill="F2F4F7"/>
+      </w:pPr>
+      <w:r>
+        <w:t>$target = resolve_target($base, $relative);</w:t>
+      </w:r>
+    </w:p>
+    <w:p>
+      <w:pPr>
+        <w:pStyle w:val="CodeBlock"/>
+        <w:shd w:fill="F2F4F7"/>
+      </w:pPr>
+      <w:r>
+        <w:t xml:space="preserve"> </w:t>
+      </w:r>
+    </w:p>
+    <w:p>
+      <w:pPr>
+        <w:pStyle w:val="CodeBlock"/>
+        <w:shd w:fill="F2F4F7"/>
+      </w:pPr>
+      <w:r>
+        <w:t>// The download endpoint serves update packages only, not arbitrary server files.</w:t>
+      </w:r>
+    </w:p>
+    <w:p>
+      <w:pPr>
+        <w:pStyle w:val="CodeBlock"/>
+        <w:shd w:fill="F2F4F7"/>
+      </w:pPr>
+      <w:r>
+        <w:t>if (!is_file($target) || !is_readable($target) ||</w:t>
+      </w:r>
+    </w:p>
+    <w:p>
+      <w:pPr>
+        <w:pStyle w:val="CodeBlock"/>
+        <w:shd w:fill="F2F4F7"/>
+      </w:pPr>
+      <w:r>
+        <w:t xml:space="preserve">    strtolower(pathinfo($relative, PATHINFO_EXTENSION)) !== 'zip' ||</w:t>
+      </w:r>
+    </w:p>
+    <w:p>
+      <w:pPr>
+        <w:pStyle w:val="CodeBlock"/>
+        <w:shd w:fill="F2F4F7"/>
+      </w:pPr>
+      <w:r>
+        <w:t xml:space="preserve">    strtolower(pathinfo($target, PATHINFO_EXTENSION)) !== 'zip') {</w:t>
+      </w:r>
+    </w:p>
+    <w:p>
+      <w:pPr>
+        <w:pStyle w:val="CodeBlock"/>
+        <w:shd w:fill="F2F4F7"/>
+      </w:pPr>
+      <w:r>
+        <w:t xml:space="preserve">    fail_request(404, 'ZIP package not found.');</w:t>
+      </w:r>
+    </w:p>
+    <w:p>
+      <w:pPr>
+        <w:pStyle w:val="CodeBlock"/>
+        <w:shd w:fill="F2F4F7"/>
+      </w:pPr>
+      <w:r>
+        <w:t>}</w:t>
+      </w:r>
+    </w:p>
+    <w:p>
+      <w:pPr>
+        <w:pStyle w:val="CodeBlock"/>
+        <w:shd w:fill="F2F4F7"/>
+      </w:pPr>
+      <w:r>
+        <w:t xml:space="preserve"> </w:t>
+      </w:r>
+    </w:p>
+    <w:p>
+      <w:pPr>
+        <w:pStyle w:val="CodeBlock"/>
+        <w:shd w:fill="F2F4F7"/>
+      </w:pPr>
+      <w:r>
+        <w:t>$stream = fopen($target, 'rb');</w:t>
+      </w:r>
+    </w:p>
+    <w:p>
+      <w:pPr>
+        <w:pStyle w:val="CodeBlock"/>
+        <w:shd w:fill="F2F4F7"/>
+      </w:pPr>
+      <w:r>
+        <w:t>if ($stream === false) {</w:t>
+      </w:r>
+    </w:p>
+    <w:p>
+      <w:pPr>
+        <w:pStyle w:val="CodeBlock"/>
+        <w:shd w:fill="F2F4F7"/>
+      </w:pPr>
+      <w:r>
+        <w:t xml:space="preserve">    fail_request(500, 'The package could not be opened.');</w:t>
+      </w:r>
+    </w:p>
+    <w:p>
+      <w:pPr>
+        <w:pStyle w:val="CodeBlock"/>
+        <w:shd w:fill="F2F4F7"/>
+      </w:pPr>
+      <w:r>
+        <w:t>}</w:t>
+      </w:r>
+    </w:p>
+    <w:p>
+      <w:pPr>
+        <w:pStyle w:val="CodeBlock"/>
+        <w:shd w:fill="F2F4F7"/>
+      </w:pPr>
+      <w:r>
+        <w:t xml:space="preserve"> </w:t>
+      </w:r>
+    </w:p>
+    <w:p>
+      <w:pPr>
+        <w:pStyle w:val="CodeBlock"/>
+        <w:shd w:fill="F2F4F7"/>
+      </w:pPr>
+      <w:r>
+        <w:t>try {</w:t>
+      </w:r>
+    </w:p>
+    <w:p>
+      <w:pPr>
+        <w:pStyle w:val="CodeBlock"/>
+        <w:shd w:fill="F2F4F7"/>
+      </w:pPr>
+      <w:r>
+        <w:t xml:space="preserve">    // Read size from the open handle so Content-Length describes the streamed file.</w:t>
+      </w:r>
+    </w:p>
+    <w:p>
+      <w:pPr>
+        <w:pStyle w:val="CodeBlock"/>
+        <w:shd w:fill="F2F4F7"/>
+      </w:pPr>
+      <w:r>
+        <w:t xml:space="preserve">    $stat = fstat($stream);</w:t>
+      </w:r>
+    </w:p>
+    <w:p>
+      <w:pPr>
+        <w:pStyle w:val="CodeBlock"/>
+        <w:shd w:fill="F2F4F7"/>
+      </w:pPr>
+      <w:r>
+        <w:t xml:space="preserve">    if ($stat === false) {</w:t>
+      </w:r>
+    </w:p>
+    <w:p>
+      <w:pPr>
+        <w:pStyle w:val="CodeBlock"/>
+        <w:shd w:fill="F2F4F7"/>
+      </w:pPr>
+      <w:r>
+        <w:t xml:space="preserve">        fail_request(500, 'Package metadata could not be read.');</w:t>
+      </w:r>
+    </w:p>
+    <w:p>
+      <w:pPr>
+        <w:pStyle w:val="CodeBlock"/>
+        <w:shd w:fill="F2F4F7"/>
+      </w:pPr>
+      <w:r>
+        <w:t xml:space="preserve">    }</w:t>
+      </w:r>
+    </w:p>
+    <w:p>
+      <w:pPr>
+        <w:pStyle w:val="CodeBlock"/>
+        <w:shd w:fill="F2F4F7"/>
+      </w:pPr>
+      <w:r>
+        <w:t xml:space="preserve"> </w:t>
+      </w:r>
+    </w:p>
+    <w:p>
+      <w:pPr>
+        <w:pStyle w:val="CodeBlock"/>
+        <w:shd w:fill="F2F4F7"/>
+      </w:pPr>
+      <w:r>
+        <w:t xml:space="preserve">    $name = basename($relative);</w:t>
+      </w:r>
+    </w:p>
+    <w:p>
+      <w:pPr>
+        <w:pStyle w:val="CodeBlock"/>
+        <w:shd w:fill="F2F4F7"/>
+      </w:pPr>
+      <w:r>
+        <w:t xml:space="preserve">    $fallback = preg_replace('/[^A-Za-z0-9._-]/', '_', $name);</w:t>
+      </w:r>
+    </w:p>
+    <w:p>
+      <w:pPr>
+        <w:pStyle w:val="CodeBlock"/>
+        <w:shd w:fill="F2F4F7"/>
+      </w:pPr>
+      <w:r>
+        <w:t xml:space="preserve">    header('Content-Type: application/octet-stream');</w:t>
+      </w:r>
+    </w:p>
+    <w:p>
+      <w:pPr>
+        <w:pStyle w:val="CodeBlock"/>
+        <w:shd w:fill="F2F4F7"/>
+      </w:pPr>
+      <w:r>
+        <w:t xml:space="preserve">    header('Content-Disposition: attachment; filename="' . $fallback . '"; filename*=UTF-8\'\'' . rawurlencode($name));</w:t>
+      </w:r>
+    </w:p>
+    <w:p>
+      <w:pPr>
+        <w:pStyle w:val="CodeBlock"/>
+        <w:shd w:fill="F2F4F7"/>
+      </w:pPr>
+      <w:r>
+        <w:t xml:space="preserve">    header('Content-Length: ' . $stat['size']);</w:t>
+      </w:r>
+    </w:p>
+    <w:p>
+      <w:pPr>
+        <w:pStyle w:val="CodeBlock"/>
+        <w:shd w:fill="F2F4F7"/>
+      </w:pPr>
+      <w:r>
+        <w:t xml:space="preserve">    header('Cache-Control: no-store');</w:t>
+      </w:r>
+    </w:p>
+    <w:p>
+      <w:pPr>
+        <w:pStyle w:val="CodeBlock"/>
+        <w:shd w:fill="F2F4F7"/>
+      </w:pPr>
+      <w:r>
+        <w:t xml:space="preserve">    header('X-Content-Type-Options: nosniff');</w:t>
+      </w:r>
+    </w:p>
+    <w:p>
+      <w:pPr>
+        <w:pStyle w:val="CodeBlock"/>
+        <w:shd w:fill="F2F4F7"/>
+      </w:pPr>
+      <w:r>
+        <w:t xml:space="preserve"> </w:t>
+      </w:r>
+    </w:p>
+    <w:p>
+      <w:pPr>
+        <w:pStyle w:val="CodeBlock"/>
+        <w:shd w:fill="F2F4F7"/>
+      </w:pPr>
+      <w:r>
+        <w:t xml:space="preserve">    // Disable PHP output buffering/compression to preserve byte counts and stream.</w:t>
+      </w:r>
+    </w:p>
+    <w:p>
+      <w:pPr>
+        <w:pStyle w:val="CodeBlock"/>
+        <w:shd w:fill="F2F4F7"/>
+      </w:pPr>
+      <w:r>
+        <w:t xml:space="preserve">    ini_set('zlib.output_compression', '0');</w:t>
+      </w:r>
+    </w:p>
+    <w:p>
+      <w:pPr>
+        <w:pStyle w:val="CodeBlock"/>
+        <w:shd w:fill="F2F4F7"/>
+      </w:pPr>
+      <w:r>
+        <w:t xml:space="preserve">    while (ob_get_level() &gt; 0) {</w:t>
+      </w:r>
+    </w:p>
+    <w:p>
+      <w:pPr>
+        <w:pStyle w:val="CodeBlock"/>
+        <w:shd w:fill="F2F4F7"/>
+      </w:pPr>
+      <w:r>
+        <w:t xml:space="preserve">        if (!ob_end_clean()) {</w:t>
+      </w:r>
+    </w:p>
+    <w:p>
+      <w:pPr>
+        <w:pStyle w:val="CodeBlock"/>
+        <w:shd w:fill="F2F4F7"/>
+      </w:pPr>
+      <w:r>
+        <w:t xml:space="preserve">            break;</w:t>
+      </w:r>
+    </w:p>
+    <w:p>
+      <w:pPr>
+        <w:pStyle w:val="CodeBlock"/>
+        <w:shd w:fill="F2F4F7"/>
+      </w:pPr>
+      <w:r>
+        <w:t xml:space="preserve">        }</w:t>
+      </w:r>
+    </w:p>
+    <w:p>
+      <w:pPr>
+        <w:pStyle w:val="CodeBlock"/>
+        <w:shd w:fill="F2F4F7"/>
+      </w:pPr>
+      <w:r>
+        <w:t xml:space="preserve">    }</w:t>
+      </w:r>
+    </w:p>
+    <w:p>
+      <w:pPr>
+        <w:pStyle w:val="CodeBlock"/>
+        <w:shd w:fill="F2F4F7"/>
+      </w:pPr>
+      <w:r>
+        <w:t xml:space="preserve"> </w:t>
+      </w:r>
+    </w:p>
+    <w:p>
+      <w:pPr>
+        <w:pStyle w:val="CodeBlock"/>
+        <w:shd w:fill="F2F4F7"/>
+      </w:pPr>
+      <w:r>
+        <w:t xml:space="preserve">    if (($_SERVER['REQUEST_METHOD'] ?? '') !== 'HEAD') {</w:t>
+      </w:r>
+    </w:p>
+    <w:p>
+      <w:pPr>
+        <w:pStyle w:val="CodeBlock"/>
+        <w:shd w:fill="F2F4F7"/>
+      </w:pPr>
+      <w:r>
+        <w:t xml:space="preserve">        fpassthru($stream);</w:t>
+      </w:r>
+    </w:p>
+    <w:p>
+      <w:pPr>
+        <w:pStyle w:val="CodeBlock"/>
+        <w:shd w:fill="F2F4F7"/>
+      </w:pPr>
+      <w:r>
+        <w:t xml:space="preserve">    }</w:t>
+      </w:r>
+    </w:p>
+    <w:p>
+      <w:pPr>
+        <w:pStyle w:val="CodeBlock"/>
+        <w:shd w:fill="F2F4F7"/>
+      </w:pPr>
+      <w:r>
+        <w:t>} finally {</w:t>
+      </w:r>
+    </w:p>
+    <w:p>
+      <w:pPr>
+        <w:pStyle w:val="CodeBlock"/>
+        <w:shd w:fill="F2F4F7"/>
+      </w:pPr>
+      <w:r>
+        <w:t xml:space="preserve">    fclose($stream);</w:t>
+      </w:r>
+    </w:p>
+    <w:p>
+      <w:pPr>
+        <w:pStyle w:val="CodeBlock"/>
+        <w:shd w:fill="F2F4F7"/>
+      </w:pPr>
+      <w:r>
+        <w:t>}</w:t>
+      </w:r>
+    </w:p>
+    <w:p>
+      <w:r>
+        <w:t>The endpoint opens only a readable ZIP inside the update root, reads its size from the open handle, sends download headers, and streams the bytes. HEAD returns metadata without the body. It does not load the whole package into memory, inspect product versions, or extract and install files.</w:t>
+      </w:r>
+    </w:p>
+    <w:p>
+      <w:pPr>
+        <w:pStyle w:val="Heading2"/>
+      </w:pPr>
+      <w:r>
+        <w:t>Keeping paths inside SQLupdate</w:t>
+      </w:r>
+    </w:p>
+    <w:p>
+      <w:r>
+        <w:t xml:space="preserve">Source: </w:t>
+      </w:r>
+      <w:r>
+        <w:rPr>
+          <w:rFonts w:ascii="Consolas" w:hAnsi="Consolas"/>
+          <w:sz w:val="18"/>
+        </w:rPr>
+        <w:t>server/common.php</w:t>
+      </w:r>
+      <w:r/>
+    </w:p>
+    <w:p>
+      <w:pPr>
+        <w:pStyle w:val="CodeBlock"/>
+        <w:shd w:fill="F2F4F7"/>
+      </w:pPr>
+      <w:r>
+        <w:t>function inside_root(string $path, string $base): bool</w:t>
+      </w:r>
+    </w:p>
+    <w:p>
+      <w:pPr>
+        <w:pStyle w:val="CodeBlock"/>
+        <w:shd w:fill="F2F4F7"/>
+      </w:pPr>
+      <w:r>
+        <w:t>{</w:t>
+      </w:r>
+    </w:p>
+    <w:p>
+      <w:pPr>
+        <w:pStyle w:val="CodeBlock"/>
+        <w:shd w:fill="F2F4F7"/>
+      </w:pPr>
+      <w:r>
+        <w:t xml:space="preserve">    // A separator boundary prevents SQLupdate-other from matching SQLupdate.</w:t>
+      </w:r>
+    </w:p>
+    <w:p>
+      <w:pPr>
+        <w:pStyle w:val="CodeBlock"/>
+        <w:shd w:fill="F2F4F7"/>
+      </w:pPr>
+      <w:r>
+        <w:t xml:space="preserve">    return $path === $base || str_starts_with($path, rtrim($base, '/\\') . DIRECTORY_SEPARATOR);</w:t>
+      </w:r>
+    </w:p>
+    <w:p>
+      <w:pPr>
+        <w:pStyle w:val="CodeBlock"/>
+        <w:shd w:fill="F2F4F7"/>
+      </w:pPr>
+      <w:r>
+        <w:t>}</w:t>
+      </w:r>
+    </w:p>
+    <w:p>
+      <w:pPr>
+        <w:pStyle w:val="CodeBlock"/>
+        <w:shd w:fill="F2F4F7"/>
+      </w:pPr>
+      <w:r>
+        <w:t xml:space="preserve"> </w:t>
+      </w:r>
+    </w:p>
+    <w:p>
+      <w:pPr>
+        <w:pStyle w:val="CodeBlock"/>
+        <w:shd w:fill="F2F4F7"/>
+      </w:pPr>
+      <w:r>
+        <w:t>function resolve_target(string $base, string $relative): string</w:t>
+      </w:r>
+    </w:p>
+    <w:p>
+      <w:pPr>
+        <w:pStyle w:val="CodeBlock"/>
+        <w:shd w:fill="F2F4F7"/>
+      </w:pPr>
+      <w:r>
+        <w:t>{</w:t>
+      </w:r>
+    </w:p>
+    <w:p>
+      <w:pPr>
+        <w:pStyle w:val="CodeBlock"/>
+        <w:shd w:fill="F2F4F7"/>
+      </w:pPr>
+      <w:r>
+        <w:t xml:space="preserve">    $target = realpath($base . DIRECTORY_SEPARATOR . $relative);</w:t>
+      </w:r>
+    </w:p>
+    <w:p>
+      <w:pPr>
+        <w:pStyle w:val="CodeBlock"/>
+        <w:shd w:fill="F2F4F7"/>
+      </w:pPr>
+      <w:r>
+        <w:t xml:space="preserve">    if ($target === false || !inside_root($target, $base)) {</w:t>
+      </w:r>
+    </w:p>
+    <w:p>
+      <w:pPr>
+        <w:pStyle w:val="CodeBlock"/>
+        <w:shd w:fill="F2F4F7"/>
+      </w:pPr>
+      <w:r>
+        <w:t xml:space="preserve">        fail_request(404, 'File or directory not found.');</w:t>
+      </w:r>
+    </w:p>
+    <w:p>
+      <w:pPr>
+        <w:pStyle w:val="CodeBlock"/>
+        <w:shd w:fill="F2F4F7"/>
+      </w:pPr>
+      <w:r>
+        <w:t xml:space="preserve">    }</w:t>
+      </w:r>
+    </w:p>
+    <w:p>
+      <w:pPr>
+        <w:pStyle w:val="CodeBlock"/>
+        <w:shd w:fill="F2F4F7"/>
+      </w:pPr>
+      <w:r>
+        <w:t xml:space="preserve"> </w:t>
+      </w:r>
+    </w:p>
+    <w:p>
+      <w:pPr>
+        <w:pStyle w:val="CodeBlock"/>
+        <w:shd w:fill="F2F4F7"/>
+      </w:pPr>
+      <w:r>
+        <w:t xml:space="preserve">    return $target;</w:t>
+      </w:r>
+    </w:p>
+    <w:p>
+      <w:pPr>
+        <w:pStyle w:val="CodeBlock"/>
+        <w:shd w:fill="F2F4F7"/>
+      </w:pPr>
+      <w:r>
+        <w:t>}</w:t>
+      </w:r>
+    </w:p>
+    <w:p>
+      <w:r>
+        <w:t>The separator boundary distinguishes SQLupdate from SQLupdate-other. realpath resolves filesystem links before the containment check. Invalid path syntax is rejected earlier by query_path. Authentication either uses trusted hosting BasicAuth through REMOTE_USER or configured TYTAN_API_USERNAME/TYTAN_API_PASSWORD values; missing configuration fails closed.</w:t>
+      </w:r>
+    </w:p>
+    <w:p>
+      <w:r>
+        <w:t>Local server tests use temporary packages and PHP processes, including real C# listing and downloading. They are separate from production deployment. See docs/server.md for configuration, deployment, error statuses, and test commands.</w:t>
       </w:r>
     </w:p>
     <w:sectPr>

</xml_diff>

<commit_message>
Corregir la compatibilidad de los endpoints con PHP 7.2
</commit_message>
<xml_diff>
--- a/docs/technical-walkthrough.docx
+++ b/docs/technical-walkthrough.docx
@@ -6266,7 +6266,7 @@
     </w:p>
     <w:p>
       <w:r>
-        <w:t>The PHP implementation is the server half of the contract. api.php lists folders and ZIP packages; download.php streams a selected ZIP. common.php shares authentication, HTTPS checks, canonical-path validation, and JSON error handling. The C# module still selects versions and Tytan still installs packages.</w:t>
+        <w:t>The PHP implementation is the server half of the contract and is tested on PHP 7.2.34 and PHP 8.5.11. Prefix checks use strpos rather than the PHP 8-only str_starts_with function. JSON encoding checks the false return value explicitly because JSON_THROW_ON_ERROR is unavailable in PHP 7.2. api.php lists folders and ZIP packages; download.php streams a selected ZIP. common.php shares authentication, HTTPS checks, canonical-path validation, and JSON error handling. The C# module still selects versions and Tytan still installs packages.</w:t>
       </w:r>
     </w:p>
     <w:p>
@@ -7311,7 +7311,16 @@
         <w:shd w:fill="F2F4F7"/>
       </w:pPr>
       <w:r>
-        <w:t xml:space="preserve">    return $path === $base || str_starts_with($path, rtrim($base, '/\\') . DIRECTORY_SEPARATOR);</w:t>
+        <w:t xml:space="preserve">    // strpos(... ) === 0 provides prefix matching on both PHP 7.2 and PHP 8.</w:t>
+      </w:r>
+    </w:p>
+    <w:p>
+      <w:pPr>
+        <w:pStyle w:val="CodeBlock"/>
+        <w:shd w:fill="F2F4F7"/>
+      </w:pPr>
+      <w:r>
+        <w:t xml:space="preserve">    return $path === $base || strpos($path, rtrim($base, '/\\') . DIRECTORY_SEPARATOR) === 0;</w:t>
       </w:r>
     </w:p>
     <w:p>

</xml_diff>

<commit_message>
Crear la primera fase de la ventana local y leer versiones instaladas
</commit_message>
<xml_diff>
--- a/docs/technical-walkthrough.docx
+++ b/docs/technical-walkthrough.docx
@@ -17,7 +17,7 @@
     </w:p>
     <w:p>
       <w:r>
-        <w:t>This document describes the delivered PHP server, its source code, deployment, integration contract, and observed results. The previous C# prototype has been removed from the current repository at the user's request. Tytan consumes these HTTP endpoints through its own application.</w:t>
+        <w:t>This document describes the delivered PHP server, its source code, deployment, integration contract, and observed results. The previous C# library/CLI prototype was removed at the user's request. A later clarification introduces a local Windows application, developed incrementally under desktop/. Its phase 1 window and provisional local installation file are documented separately in desktop.md. This guide remains the PHP server reference.</w:t>
       </w:r>
     </w:p>
     <w:p>
@@ -3633,7 +3633,7 @@
     </w:p>
     <w:p>
       <w:r>
-        <w:t>The former C# tests passed 17/17 before removal; this is historical evidence and no longer a runnable part of the current repository. The retained test command needs Python and PHP only.</w:t>
+        <w:t>The former C# prototype tests passed 17/17 before removal; this is historical evidence and no longer a runnable part of the current repository. The retained PHP test command needs Python and PHP only. The new desktop application has separate checks documented in desktop.md.</w:t>
       </w:r>
     </w:p>
     <w:p>

</xml_diff>

<commit_message>
Descargar actualizaciones con progreso y validar los paquetes ZIP
</commit_message>
<xml_diff>
--- a/docs/technical-walkthrough.docx
+++ b/docs/technical-walkthrough.docx
@@ -12,12 +12,12 @@
     </w:p>
     <w:p>
       <w:r>
-        <w:t>Updated: October 6, 2026.</w:t>
-      </w:r>
-    </w:p>
-    <w:p>
-      <w:r>
-        <w:t>This document describes the delivered PHP server, its source code, deployment, integration contract, and observed results. The previous C# library/CLI prototype was removed at the user's request. A later clarification introduces a local Windows application, developed incrementally under desktop/. Its local-file window, HTTPS cloud listing, and phase 3 numeric version comparison are documented separately in desktop.md. This guide remains the PHP server reference.</w:t>
+        <w:t>Updated: October 7, 2026.</w:t>
+      </w:r>
+    </w:p>
+    <w:p>
+      <w:r>
+        <w:t>This document describes the delivered PHP server, its source code, deployment, integration contract, and observed results. The previous C# library/CLI prototype was removed at the user's request. A later clarification introduces a local Windows application, developed incrementally under desktop/. Its local-file window, HTTPS cloud listing, phase 3 numeric version comparison, and phase 4 validated ZIP download are documented separately in desktop.md. This guide remains the PHP server reference.</w:t>
       </w:r>
     </w:p>
     <w:p>

</xml_diff>

<commit_message>
Documentar en detalle la implementación técnica y el uso de la primera distribución
</commit_message>
<xml_diff>
--- a/docs/technical-walkthrough.docx
+++ b/docs/technical-walkthrough.docx
@@ -18,6 +18,33 @@
     <w:p>
       <w:r>
         <w:t>This document describes the delivered PHP server, its source code, deployment, integration contract, and observed results. The previous C# library/CLI prototype was removed at the user's request. A later clarification introduces a local Windows application, developed incrementally under desktop/. Its local-file window, HTTPS cloud listing, phase 3 numeric version comparison, and phase 4 validated ZIP download are documented separately in desktop.md. This guide remains the PHP server reference.</w:t>
+      </w:r>
+    </w:p>
+    <w:p>
+      <w:r>
+        <w:t xml:space="preserve">For the complete retained implementation, including desktop, CLI, comparison, downloads, packaging, and method references, see </w:t>
+      </w:r>
+      <w:hyperlink r:id="rId9">
+        <w:r>
+          <w:rPr>
+            <w:rStyle w:val="Hyperlink"/>
+          </w:rPr>
+          <w:t>Technical guide</w:t>
+        </w:r>
+      </w:hyperlink>
+      <w:r>
+        <w:t xml:space="preserve">. End-user steps are in </w:t>
+      </w:r>
+      <w:hyperlink r:id="rId10">
+        <w:r>
+          <w:rPr>
+            <w:rStyle w:val="Hyperlink"/>
+          </w:rPr>
+          <w:t>User guide</w:t>
+        </w:r>
+      </w:hyperlink>
+      <w:r>
+        <w:t>. This walkthrough remains the supplementary PHP source reference.</w:t>
       </w:r>
     </w:p>
     <w:p>
@@ -2836,6 +2863,9 @@
         <w:gridCol w:w="4933"/>
       </w:tblGrid>
       <w:tr>
+        <w:trPr>
+          <w:tblHeader/>
+        </w:trPr>
         <w:tc>
           <w:tcPr>
             <w:tcW w:type="dxa" w:w="4933"/>
@@ -3079,6 +3109,9 @@
         <w:gridCol w:w="4933"/>
       </w:tblGrid>
       <w:tr>
+        <w:trPr>
+          <w:tblHeader/>
+        </w:trPr>
         <w:tc>
           <w:tcPr>
             <w:tcW w:type="dxa" w:w="4933"/>
@@ -3295,6 +3328,9 @@
         <w:gridCol w:w="2466"/>
       </w:tblGrid>
       <w:tr>
+        <w:trPr>
+          <w:tblHeader/>
+        </w:trPr>
         <w:tc>
           <w:tcPr>
             <w:tcW w:type="dxa" w:w="2466"/>
@@ -3451,6 +3487,9 @@
         <w:gridCol w:w="3289"/>
       </w:tblGrid>
       <w:tr>
+        <w:trPr>
+          <w:tblHeader/>
+        </w:trPr>
         <w:tc>
           <w:tcPr>
             <w:tcW w:type="dxa" w:w="3289"/>
@@ -3665,8 +3704,8 @@
       </w:r>
     </w:p>
     <w:sectPr>
-      <w:headerReference w:type="default" r:id="rId9"/>
-      <w:footerReference w:type="default" r:id="rId10"/>
+      <w:headerReference w:type="default" r:id="rId11"/>
+      <w:footerReference w:type="default" r:id="rId12"/>
       <w:pgSz w:w="11906" w:h="16838"/>
       <w:pgMar w:top="1134" w:right="1020" w:bottom="1134" w:left="1020" w:header="720" w:footer="720" w:gutter="0"/>
       <w:cols w:space="720"/>
@@ -3701,7 +3740,7 @@
       <w:rPr>
         <w:sz w:val="16"/>
       </w:rPr>
-      <w:t>TYTAN UPDATER | PHP SERVER TECHNICAL DOCUMENTATION</w:t>
+      <w:t>TYTAN UPDATER - PHP SERVER TECHNICAL DOCUMENTATION</w:t>
     </w:r>
   </w:p>
 </w:hdr>

</xml_diff>